<commit_message>
Corrige acentuacao no Word processo_gestao_abertura_triagem_gestao_chamados
</commit_message>
<xml_diff>
--- a/documentações/Processos/docx/processo_gestao_abertura_triagem_gestao_chamados.docx
+++ b/documentações/Processos/docx/processo_gestao_abertura_triagem_gestao_chamados.docx
@@ -41,7 +41,7 @@
           <w:color w:val="5E6B78"/>
           <w:sz w:val="19"/>
         </w:rPr>
-        <w:t>Ãrea responsÃ¡vel e versÃ£o conforme documentaÃ§Ã£o institucional</w:t>
+        <w:t>Área responsável e versão conforme documentação institucional</w:t>
       </w:r>
     </w:p>
     <w:p>
@@ -1800,6 +1800,8 @@
     <w:sectPr>
       <w:headerReference w:type="default" r:id="rId9"/>
       <w:footerReference w:type="default" r:id="rId10"/>
+      <w:headerReference w:type="first" r:id="rId11"/>
+      <w:footerReference w:type="first" r:id="rId12"/>
       <w:pgSz w:w="12240" w:h="15840"/>
       <w:pgMar w:top="1080" w:right="1123" w:bottom="1080" w:left="1123" w:header="504" w:footer="504" w:gutter="0"/>
       <w:cols w:space="720"/>
@@ -1822,7 +1824,7 @@
         <w:color w:val="5E6B78"/>
         <w:sz w:val="17"/>
       </w:rPr>
-      <w:t xml:space="preserve">Secretaria de SaÃºde do Recife  |  </w:t>
+      <w:t xml:space="preserve">Secretaria de Saúde do Recife  |  </w:t>
     </w:r>
     <w:r>
       <w:rPr>
@@ -1830,9 +1832,19 @@
         <w:color w:val="5E6B78"/>
         <w:sz w:val="18"/>
       </w:rPr>
-      <w:t xml:space="preserve">PÃ¡gina </w:t>
+      <w:t xml:space="preserve">Página </w:t>
     </w:r>
     <w:fldSimple w:instr="PAGE"/>
+  </w:p>
+</w:ftr>
+</file>
+
+<file path=word/footer2.xml><?xml version="1.0" encoding="utf-8"?>
+<w:ftr xmlns:m="http://schemas.openxmlformats.org/officeDocument/2006/math" xmlns:mc="http://schemas.openxmlformats.org/markup-compatibility/2006" xmlns:mo="http://schemas.microsoft.com/office/mac/office/2008/main" xmlns:mv="urn:schemas-microsoft-com:mac:vml" xmlns:o="urn:schemas-microsoft-com:office:office" xmlns:r="http://schemas.openxmlformats.org/officeDocument/2006/relationships" xmlns:v="urn:schemas-microsoft-com:vml" xmlns:w10="urn:schemas-microsoft-com:office:word" xmlns:w14="http://schemas.microsoft.com/office/word/2010/wordml" xmlns:w="http://schemas.openxmlformats.org/wordprocessingml/2006/main" xmlns:wne="http://schemas.microsoft.com/office/word/2006/wordml" xmlns:wp14="http://schemas.microsoft.com/office/word/2010/wordprocessingDrawing" xmlns:wp="http://schemas.openxmlformats.org/drawingml/2006/wordprocessingDrawing" xmlns:wpc="http://schemas.microsoft.com/office/word/2010/wordprocessingCanvas" xmlns:wpg="http://schemas.microsoft.com/office/word/2010/wordprocessingGroup" xmlns:wpi="http://schemas.microsoft.com/office/word/2010/wordprocessingInk" xmlns:wps="http://schemas.microsoft.com/office/word/2010/wordprocessingShape" mc:Ignorable="w14 wp14">
+  <w:p>
+    <w:pPr>
+      <w:pStyle w:val="Footer"/>
+    </w:pPr>
   </w:p>
 </w:ftr>
 </file>
@@ -1851,8 +1863,18 @@
         <w:color w:val="5E6B78"/>
         <w:sz w:val="17"/>
       </w:rPr>
-      <w:t>SAÃšDE DIGITAL ATENDE  |  PROCESSO OPERACIONAL</w:t>
+      <w:t>SAÚDE DIGITAL ATENDE  |  PROCESSO OPERACIONAL</w:t>
     </w:r>
+  </w:p>
+</w:hdr>
+</file>
+
+<file path=word/header2.xml><?xml version="1.0" encoding="utf-8"?>
+<w:hdr xmlns:m="http://schemas.openxmlformats.org/officeDocument/2006/math" xmlns:mc="http://schemas.openxmlformats.org/markup-compatibility/2006" xmlns:mo="http://schemas.microsoft.com/office/mac/office/2008/main" xmlns:mv="urn:schemas-microsoft-com:mac:vml" xmlns:o="urn:schemas-microsoft-com:office:office" xmlns:r="http://schemas.openxmlformats.org/officeDocument/2006/relationships" xmlns:v="urn:schemas-microsoft-com:vml" xmlns:w10="urn:schemas-microsoft-com:office:word" xmlns:w14="http://schemas.microsoft.com/office/word/2010/wordml" xmlns:w="http://schemas.openxmlformats.org/wordprocessingml/2006/main" xmlns:wne="http://schemas.microsoft.com/office/word/2006/wordml" xmlns:wp14="http://schemas.microsoft.com/office/word/2010/wordprocessingDrawing" xmlns:wp="http://schemas.openxmlformats.org/drawingml/2006/wordprocessingDrawing" xmlns:wpc="http://schemas.microsoft.com/office/word/2010/wordprocessingCanvas" xmlns:wpg="http://schemas.microsoft.com/office/word/2010/wordprocessingGroup" xmlns:wpi="http://schemas.microsoft.com/office/word/2010/wordprocessingInk" xmlns:wps="http://schemas.microsoft.com/office/word/2010/wordprocessingShape" mc:Ignorable="w14 wp14">
+  <w:p>
+    <w:pPr>
+      <w:pStyle w:val="Header"/>
+    </w:pPr>
   </w:p>
 </w:hdr>
 </file>

</xml_diff>

<commit_message>
Atualiza Word padronizado processo_gestao_abertura_triagem_gestao_chamados
</commit_message>
<xml_diff>
--- a/documentações/Processos/docx/processo_gestao_abertura_triagem_gestao_chamados.docx
+++ b/documentações/Processos/docx/processo_gestao_abertura_triagem_gestao_chamados.docx
@@ -49,7 +49,1799 @@
         <w:pStyle w:val="Heading1"/>
       </w:pPr>
       <w:r>
-        <w:t>01 Histórico de Revisões</w:t>
+        <w:t>Identificação</w:t>
+      </w:r>
+    </w:p>
+    <w:tbl>
+      <w:tblPr>
+        <w:tblStyle w:val="TableGrid"/>
+        <w:tblW w:type="auto" w:w="0"/>
+        <w:jc w:val="center"/>
+        <w:tblLayout w:type="fixed"/>
+        <w:tblLook w:firstColumn="1" w:firstRow="1" w:lastColumn="0" w:lastRow="0" w:noHBand="0" w:noVBand="1" w:val="04A0"/>
+      </w:tblPr>
+      <w:tblGrid>
+        <w:gridCol w:w="2600"/>
+        <w:gridCol w:w="6760"/>
+      </w:tblGrid>
+      <w:tr>
+        <w:tc>
+          <w:tcPr>
+            <w:tcW w:type="dxa" w:w="2600"/>
+            <w:tcMar>
+              <w:top w:w="90" w:type="dxa"/>
+              <w:start w:w="120" w:type="dxa"/>
+              <w:bottom w:w="90" w:type="dxa"/>
+              <w:end w:w="120" w:type="dxa"/>
+            </w:tcMar>
+            <w:vAlign w:val="center"/>
+          </w:tcPr>
+          <w:p>
+            <w:pPr>
+              <w:spacing w:after="0"/>
+            </w:pPr>
+            <w:r>
+              <w:rPr>
+                <w:rFonts w:ascii="Arial" w:hAnsi="Arial"/>
+                <w:sz w:val="18"/>
+              </w:rPr>
+              <w:t>Tipo</w:t>
+            </w:r>
+          </w:p>
+        </w:tc>
+        <w:tc>
+          <w:tcPr>
+            <w:tcW w:type="dxa" w:w="6760"/>
+            <w:tcMar>
+              <w:top w:w="90" w:type="dxa"/>
+              <w:start w:w="120" w:type="dxa"/>
+              <w:bottom w:w="90" w:type="dxa"/>
+              <w:end w:w="120" w:type="dxa"/>
+            </w:tcMar>
+            <w:vAlign w:val="center"/>
+          </w:tcPr>
+          <w:p>
+            <w:pPr>
+              <w:spacing w:after="0"/>
+            </w:pPr>
+            <w:r>
+              <w:rPr>
+                <w:rFonts w:ascii="Arial" w:hAnsi="Arial"/>
+                <w:sz w:val="18"/>
+              </w:rPr>
+              <w:t>Processo Operacional</w:t>
+            </w:r>
+          </w:p>
+        </w:tc>
+      </w:tr>
+      <w:tr>
+        <w:tc>
+          <w:tcPr>
+            <w:tcW w:type="dxa" w:w="2600"/>
+            <w:tcMar>
+              <w:top w:w="90" w:type="dxa"/>
+              <w:start w:w="120" w:type="dxa"/>
+              <w:bottom w:w="90" w:type="dxa"/>
+              <w:end w:w="120" w:type="dxa"/>
+            </w:tcMar>
+            <w:vAlign w:val="center"/>
+          </w:tcPr>
+          <w:p>
+            <w:pPr>
+              <w:spacing w:after="0"/>
+            </w:pPr>
+            <w:r>
+              <w:rPr>
+                <w:rFonts w:ascii="Arial" w:hAnsi="Arial"/>
+                <w:sz w:val="18"/>
+              </w:rPr>
+              <w:t>Título</w:t>
+            </w:r>
+          </w:p>
+        </w:tc>
+        <w:tc>
+          <w:tcPr>
+            <w:tcW w:type="dxa" w:w="6760"/>
+            <w:tcMar>
+              <w:top w:w="90" w:type="dxa"/>
+              <w:start w:w="120" w:type="dxa"/>
+              <w:bottom w:w="90" w:type="dxa"/>
+              <w:end w:w="120" w:type="dxa"/>
+            </w:tcMar>
+            <w:vAlign w:val="center"/>
+          </w:tcPr>
+          <w:p>
+            <w:pPr>
+              <w:spacing w:after="0"/>
+            </w:pPr>
+            <w:r>
+              <w:rPr>
+                <w:rFonts w:ascii="Arial" w:hAnsi="Arial"/>
+                <w:sz w:val="18"/>
+              </w:rPr>
+              <w:t>Processo Operacional – Gestão da Abertura e Triagem de Chamados</w:t>
+            </w:r>
+          </w:p>
+        </w:tc>
+      </w:tr>
+      <w:tr>
+        <w:tc>
+          <w:tcPr>
+            <w:tcW w:type="dxa" w:w="2600"/>
+            <w:tcMar>
+              <w:top w:w="90" w:type="dxa"/>
+              <w:start w:w="120" w:type="dxa"/>
+              <w:bottom w:w="90" w:type="dxa"/>
+              <w:end w:w="120" w:type="dxa"/>
+            </w:tcMar>
+            <w:vAlign w:val="center"/>
+          </w:tcPr>
+          <w:p>
+            <w:pPr>
+              <w:spacing w:after="0"/>
+            </w:pPr>
+            <w:r>
+              <w:rPr>
+                <w:rFonts w:ascii="Arial" w:hAnsi="Arial"/>
+                <w:sz w:val="18"/>
+              </w:rPr>
+              <w:t>Área responsável</w:t>
+            </w:r>
+          </w:p>
+        </w:tc>
+        <w:tc>
+          <w:tcPr>
+            <w:tcW w:type="dxa" w:w="6760"/>
+            <w:tcMar>
+              <w:top w:w="90" w:type="dxa"/>
+              <w:start w:w="120" w:type="dxa"/>
+              <w:bottom w:w="90" w:type="dxa"/>
+              <w:end w:w="120" w:type="dxa"/>
+            </w:tcMar>
+            <w:vAlign w:val="center"/>
+          </w:tcPr>
+          <w:p>
+            <w:pPr>
+              <w:spacing w:after="0"/>
+            </w:pPr>
+            <w:r>
+              <w:rPr>
+                <w:rFonts w:ascii="Arial" w:hAnsi="Arial"/>
+                <w:sz w:val="18"/>
+              </w:rPr>
+              <w:t>Administrativo, Infraestrutura e Sistemas</w:t>
+            </w:r>
+          </w:p>
+        </w:tc>
+      </w:tr>
+      <w:tr>
+        <w:tc>
+          <w:tcPr>
+            <w:tcW w:type="dxa" w:w="2600"/>
+            <w:tcMar>
+              <w:top w:w="90" w:type="dxa"/>
+              <w:start w:w="120" w:type="dxa"/>
+              <w:bottom w:w="90" w:type="dxa"/>
+              <w:end w:w="120" w:type="dxa"/>
+            </w:tcMar>
+            <w:vAlign w:val="center"/>
+          </w:tcPr>
+          <w:p>
+            <w:pPr>
+              <w:spacing w:after="0"/>
+            </w:pPr>
+            <w:r>
+              <w:rPr>
+                <w:rFonts w:ascii="Arial" w:hAnsi="Arial"/>
+                <w:sz w:val="18"/>
+              </w:rPr>
+              <w:t>Versão</w:t>
+            </w:r>
+          </w:p>
+        </w:tc>
+        <w:tc>
+          <w:tcPr>
+            <w:tcW w:type="dxa" w:w="6760"/>
+            <w:tcMar>
+              <w:top w:w="90" w:type="dxa"/>
+              <w:start w:w="120" w:type="dxa"/>
+              <w:bottom w:w="90" w:type="dxa"/>
+              <w:end w:w="120" w:type="dxa"/>
+            </w:tcMar>
+            <w:vAlign w:val="center"/>
+          </w:tcPr>
+          <w:p>
+            <w:pPr>
+              <w:spacing w:after="0"/>
+            </w:pPr>
+            <w:r>
+              <w:rPr>
+                <w:rFonts w:ascii="Arial" w:hAnsi="Arial"/>
+                <w:sz w:val="18"/>
+              </w:rPr>
+              <w:t>2026</w:t>
+            </w:r>
+          </w:p>
+        </w:tc>
+      </w:tr>
+    </w:tbl>
+    <w:p>
+      <w:pPr>
+        <w:spacing w:after="40"/>
+      </w:pPr>
+    </w:p>
+    <w:p>
+      <w:pPr>
+        <w:pStyle w:val="Heading1"/>
+      </w:pPr>
+      <w:r>
+        <w:t>Objetivo</w:t>
+      </w:r>
+    </w:p>
+    <w:p>
+      <w:r>
+        <w:t xml:space="preserve">Estabelecer diretrizes, padrões e responsabilidades para a abertura, registro, categorização, atendimento e escalonamento de chamados no sistema GLPI, garantindo </w:t>
+      </w:r>
+      <w:r>
+        <w:rPr>
+          <w:b/>
+        </w:rPr>
+        <w:t>padronização</w:t>
+      </w:r>
+      <w:r>
+        <w:t xml:space="preserve">, </w:t>
+      </w:r>
+      <w:r>
+        <w:rPr>
+          <w:b/>
+        </w:rPr>
+        <w:t>transparência</w:t>
+      </w:r>
+      <w:r>
+        <w:t xml:space="preserve">, </w:t>
+      </w:r>
+      <w:r>
+        <w:rPr>
+          <w:b/>
+        </w:rPr>
+        <w:t>rastreabilidade</w:t>
+      </w:r>
+      <w:r>
+        <w:t xml:space="preserve"> e </w:t>
+      </w:r>
+      <w:r>
+        <w:rPr>
+          <w:b/>
+        </w:rPr>
+        <w:t>qualidade</w:t>
+      </w:r>
+      <w:r>
+        <w:t xml:space="preserve"> na prestação dos serviços de Tecnologia da Informação.</w:t>
+      </w:r>
+    </w:p>
+    <w:p>
+      <w:pPr>
+        <w:pStyle w:val="Heading2"/>
+      </w:pPr>
+      <w:r>
+        <w:t>02 Apresentação</w:t>
+      </w:r>
+    </w:p>
+    <w:p>
+      <w:r>
+        <w:t xml:space="preserve">Este Processo Operacional tem como finalidade orientar usuários e equipes da GTIC quanto à correta abertura, registro, categorização e tratamento de chamados no sistema </w:t>
+      </w:r>
+      <w:r>
+        <w:rPr>
+          <w:b/>
+        </w:rPr>
+        <w:t>GLPI</w:t>
+      </w:r>
+      <w:r>
+        <w:t>, considerando as melhorias implementadas no fluxo de atendimento.</w:t>
+      </w:r>
+    </w:p>
+    <w:p>
+      <w:r>
+        <w:t xml:space="preserve">O documento foi elaborado a partir de estudo técnico, análise operacional e amadurecimento do uso da ferramenta, estando alinhado às necessidades institucionais e às boas práticas de Governança de TI, especialmente aos referenciais da </w:t>
+      </w:r>
+      <w:r>
+        <w:rPr>
+          <w:b/>
+        </w:rPr>
+        <w:t>ITIL</w:t>
+      </w:r>
+      <w:r>
+        <w:t>.</w:t>
+      </w:r>
+    </w:p>
+    <w:p>
+      <w:r>
+        <w:t xml:space="preserve">A padronização aqui estabelecida visa assegurar </w:t>
+      </w:r>
+      <w:r>
+        <w:rPr>
+          <w:b/>
+        </w:rPr>
+        <w:t>transparência</w:t>
+      </w:r>
+      <w:r>
+        <w:t xml:space="preserve">, </w:t>
+      </w:r>
+      <w:r>
+        <w:rPr>
+          <w:b/>
+        </w:rPr>
+        <w:t>rastreabilidade</w:t>
+      </w:r>
+      <w:r>
+        <w:t xml:space="preserve">, </w:t>
+      </w:r>
+      <w:r>
+        <w:rPr>
+          <w:b/>
+        </w:rPr>
+        <w:t>qualidade das informações</w:t>
+      </w:r>
+      <w:r>
+        <w:t xml:space="preserve"> e </w:t>
+      </w:r>
+      <w:r>
+        <w:rPr>
+          <w:b/>
+        </w:rPr>
+        <w:t>melhoria contínua</w:t>
+      </w:r>
+      <w:r>
+        <w:t xml:space="preserve"> dos serviços prestados.</w:t>
+      </w:r>
+    </w:p>
+    <w:p>
+      <w:pPr>
+        <w:pStyle w:val="Heading2"/>
+      </w:pPr>
+      <w:r>
+        <w:t>04 Visão Geral do Processo de Atendimento no GLPI</w:t>
+      </w:r>
+    </w:p>
+    <w:p>
+      <w:r>
+        <w:t xml:space="preserve">A partir da abertura de um chamado no GLPI, o usuário recebe notificação automática por e-mail no momento da </w:t>
+      </w:r>
+      <w:r>
+        <w:rPr>
+          <w:b/>
+        </w:rPr>
+        <w:t>abertura</w:t>
+      </w:r>
+      <w:r>
+        <w:t xml:space="preserve"> e no momento do </w:t>
+      </w:r>
+      <w:r>
+        <w:rPr>
+          <w:b/>
+        </w:rPr>
+        <w:t>encerramento</w:t>
+      </w:r>
+      <w:r>
+        <w:t>.</w:t>
+      </w:r>
+    </w:p>
+    <w:p>
+      <w:r>
+        <w:t xml:space="preserve">Essas notificações visam ampliar a </w:t>
+      </w:r>
+      <w:r>
+        <w:rPr>
+          <w:b/>
+        </w:rPr>
+        <w:t>transparência do atendimento</w:t>
+      </w:r>
+      <w:r>
+        <w:t xml:space="preserve"> e fortalecer a cultura de </w:t>
+      </w:r>
+      <w:r>
+        <w:rPr>
+          <w:b/>
+        </w:rPr>
+        <w:t>qualidade e melhoria contínua</w:t>
+      </w:r>
+      <w:r>
+        <w:t>.</w:t>
+      </w:r>
+    </w:p>
+    <w:p>
+      <w:pPr>
+        <w:pStyle w:val="Heading1"/>
+      </w:pPr>
+      <w:r>
+        <w:t>Fluxo resumido</w:t>
+      </w:r>
+    </w:p>
+    <w:p>
+      <w:pPr>
+        <w:spacing w:after="80"/>
+      </w:pPr>
+      <w:r>
+        <w:t>1. Receber A Central de Serviços coleta os dados e identifica a necessidade apresentada.</w:t>
+      </w:r>
+    </w:p>
+    <w:p>
+      <w:pPr>
+        <w:spacing w:after="80"/>
+      </w:pPr>
+      <w:r>
+        <w:t>2. Abrir e categorizar Registra um chamado por demanda, usando a categoria e o template correspondentes.</w:t>
+      </w:r>
+    </w:p>
+    <w:p>
+      <w:pPr>
+        <w:spacing w:after="80"/>
+      </w:pPr>
+      <w:r>
+        <w:t>3. Triar e direcionar Resolve no primeiro nível ou escala para a equipe responsável conforme a complexidade.</w:t>
+      </w:r>
+    </w:p>
+    <w:p>
+      <w:pPr>
+        <w:spacing w:after="80"/>
+      </w:pPr>
+      <w:r>
+        <w:t>4. Solucionar e encerrar Registra a solução, comunica o usuário e preserva o histórico para gestão e melhoria.</w:t>
+      </w:r>
+    </w:p>
+    <w:p>
+      <w:pPr>
+        <w:pStyle w:val="Heading1"/>
+      </w:pPr>
+      <w:r>
+        <w:t>Processo 1 - Notificações Automáticas por E-mail</w:t>
+      </w:r>
+    </w:p>
+    <w:p>
+      <w:pPr>
+        <w:pStyle w:val="Heading2"/>
+      </w:pPr>
+      <w:r>
+        <w:t>5.1 Notificação de Abertura do Chamado</w:t>
+      </w:r>
+    </w:p>
+    <w:p>
+      <w:r>
+        <w:t>Após o registro do chamado no GLPI, o usuário receberá automaticamente um e-mail de confirmação contendo:</w:t>
+      </w:r>
+    </w:p>
+    <w:p>
+      <w:pPr>
+        <w:pStyle w:val="ListBullet"/>
+        <w:spacing w:after="80"/>
+      </w:pPr>
+      <w:r>
+        <w:t>🎫 Número do ticket</w:t>
+      </w:r>
+    </w:p>
+    <w:p>
+      <w:pPr>
+        <w:pStyle w:val="ListBullet"/>
+        <w:spacing w:after="80"/>
+      </w:pPr>
+      <w:r>
+        <w:t>👤 Nome do usuário</w:t>
+      </w:r>
+    </w:p>
+    <w:p>
+      <w:pPr>
+        <w:pStyle w:val="ListBullet"/>
+        <w:spacing w:after="80"/>
+      </w:pPr>
+      <w:r>
+        <w:t>📅 Data e hora de abertura do chamado</w:t>
+      </w:r>
+    </w:p>
+    <w:p>
+      <w:r>
+        <w:t xml:space="preserve">O e-mail será enviado automaticamente através da integração entre </w:t>
+      </w:r>
+      <w:r>
+        <w:rPr>
+          <w:b/>
+        </w:rPr>
+        <w:t>GLPI</w:t>
+      </w:r>
+      <w:r>
+        <w:t xml:space="preserve"> e </w:t>
+      </w:r>
+      <w:r>
+        <w:rPr>
+          <w:b/>
+        </w:rPr>
+        <w:t>n8n</w:t>
+      </w:r>
+      <w:r>
+        <w:t xml:space="preserve">, com processamento periódico a cada </w:t>
+      </w:r>
+      <w:r>
+        <w:rPr>
+          <w:b/>
+        </w:rPr>
+        <w:t>5 minutos</w:t>
+      </w:r>
+      <w:r>
+        <w:t>.</w:t>
+      </w:r>
+    </w:p>
+    <w:p>
+      <w:pPr>
+        <w:spacing w:after="80"/>
+      </w:pPr>
+      <w:r>
+        <w:rPr>
+          <w:color w:val="163A63"/>
+        </w:rPr>
+        <w:t>📌 Importante: As informações enviadas ao usuário refletem exatamente os dados registrados no chamado. Portanto, os campos devem ser preenchidos corretamente, utilizando linguagem clara, objetiva e formal.</w:t>
+      </w:r>
+    </w:p>
+    <w:p>
+      <w:pPr>
+        <w:pStyle w:val="Heading2"/>
+      </w:pPr>
+      <w:r>
+        <w:t>5.2 Notificação de Encerramento do Chamado</w:t>
+      </w:r>
+    </w:p>
+    <w:p>
+      <w:r>
+        <w:t xml:space="preserve">Após o encerramento do chamado com status </w:t>
+      </w:r>
+      <w:r>
+        <w:rPr>
+          <w:b/>
+        </w:rPr>
+        <w:t>Fechado</w:t>
+      </w:r>
+      <w:r>
+        <w:t>, o usuário receberá automaticamente um e-mail contendo:</w:t>
+      </w:r>
+    </w:p>
+    <w:p>
+      <w:pPr>
+        <w:pStyle w:val="ListBullet"/>
+        <w:spacing w:after="80"/>
+      </w:pPr>
+      <w:r>
+        <w:t>🎫 Número do ticket</w:t>
+      </w:r>
+    </w:p>
+    <w:p>
+      <w:pPr>
+        <w:pStyle w:val="ListBullet"/>
+        <w:spacing w:after="80"/>
+      </w:pPr>
+      <w:r>
+        <w:t>👤 Nome do usuário</w:t>
+      </w:r>
+    </w:p>
+    <w:p>
+      <w:pPr>
+        <w:pStyle w:val="ListBullet"/>
+        <w:spacing w:after="80"/>
+      </w:pPr>
+      <w:r>
+        <w:t>📅 Data de abertura</w:t>
+      </w:r>
+    </w:p>
+    <w:p>
+      <w:pPr>
+        <w:pStyle w:val="ListBullet"/>
+        <w:spacing w:after="80"/>
+      </w:pPr>
+      <w:r>
+        <w:t>✅ Confirmação da finalização do chamado</w:t>
+      </w:r>
+    </w:p>
+    <w:p>
+      <w:pPr>
+        <w:pStyle w:val="ListBullet"/>
+        <w:spacing w:after="80"/>
+      </w:pPr>
+      <w:r>
+        <w:t>⭐ Link da pesquisa de satisfação</w:t>
+      </w:r>
+    </w:p>
+    <w:p>
+      <w:r>
+        <w:t xml:space="preserve">A pesquisa de satisfação tem como objetivo fortalecer a </w:t>
+      </w:r>
+      <w:r>
+        <w:rPr>
+          <w:b/>
+        </w:rPr>
+        <w:t>melhoria contínua</w:t>
+      </w:r>
+      <w:r>
+        <w:t xml:space="preserve"> dos atendimentos prestados pela GTIC.</w:t>
+      </w:r>
+    </w:p>
+    <w:p>
+      <w:pPr>
+        <w:spacing w:after="80"/>
+      </w:pPr>
+      <w:r>
+        <w:rPr>
+          <w:color w:val="163A63"/>
+        </w:rPr>
+        <w:t>⚠️ Atenção: Chamados apenas com status "Solucionado" não disparam a notificação automática de encerramento.</w:t>
+      </w:r>
+    </w:p>
+    <w:p>
+      <w:pPr>
+        <w:pStyle w:val="Heading2"/>
+      </w:pPr>
+      <w:r>
+        <w:t>5.3 Regras Obrigatórias para Funcionamento das Notificações</w:t>
+      </w:r>
+    </w:p>
+    <w:p>
+      <w:pPr>
+        <w:pStyle w:val="ListBullet"/>
+        <w:spacing w:after="80"/>
+      </w:pPr>
+      <w:r>
+        <w:t>📧 O campo E-mail deverá obrigatoriamente ser preenchido no momento da abertura do chamado</w:t>
+      </w:r>
+    </w:p>
+    <w:p>
+      <w:pPr>
+        <w:pStyle w:val="ListBullet"/>
+        <w:spacing w:after="80"/>
+      </w:pPr>
+      <w:r>
+        <w:t>🔗 Os scripts de Sistemas e Infraestrutura encontram-se padronizados e integrados ao n8n</w:t>
+      </w:r>
+    </w:p>
+    <w:p>
+      <w:pPr>
+        <w:pStyle w:val="ListBullet"/>
+        <w:spacing w:after="80"/>
+      </w:pPr>
+      <w:r>
+        <w:t>🚫 Os campos padronizados não deverão ser alterados sem validação prévia da administração do GLPI</w:t>
+      </w:r>
+    </w:p>
+    <w:p>
+      <w:pPr>
+        <w:pStyle w:val="ListBullet"/>
+        <w:spacing w:after="80"/>
+      </w:pPr>
+      <w:r>
+        <w:t>⚠️ Alterações indevidas poderão comprometer o funcionamento das notificações automáticas e integrações sistêmicas</w:t>
+      </w:r>
+    </w:p>
+    <w:p>
+      <w:pPr>
+        <w:pStyle w:val="Heading1"/>
+      </w:pPr>
+      <w:r>
+        <w:t>Processo 2 - Orientações e Passo a Passo para Atendimento</w:t>
+      </w:r>
+    </w:p>
+    <w:p>
+      <w:pPr>
+        <w:pStyle w:val="Heading2"/>
+      </w:pPr>
+      <w:r>
+        <w:t>6.1 Linguagem e Escrita</w:t>
+      </w:r>
+    </w:p>
+    <w:p>
+      <w:r>
+        <w:t>Ao abrir um chamado, o usuário deve:</w:t>
+      </w:r>
+    </w:p>
+    <w:p>
+      <w:pPr>
+        <w:pStyle w:val="ListBullet"/>
+        <w:spacing w:after="80"/>
+      </w:pPr>
+      <w:r>
+        <w:t>✅ Utilizar linguagem formal</w:t>
+      </w:r>
+    </w:p>
+    <w:p>
+      <w:pPr>
+        <w:pStyle w:val="ListBullet"/>
+        <w:spacing w:after="80"/>
+      </w:pPr>
+      <w:r>
+        <w:t>✅ Redigir frases claras e objetivas</w:t>
+      </w:r>
+    </w:p>
+    <w:p>
+      <w:pPr>
+        <w:pStyle w:val="ListBullet"/>
+        <w:spacing w:after="80"/>
+      </w:pPr>
+      <w:r>
+        <w:t>✅ Atentar para a concordância verbal e nominal</w:t>
+      </w:r>
+    </w:p>
+    <w:p>
+      <w:pPr>
+        <w:pStyle w:val="ListBullet"/>
+        <w:spacing w:after="80"/>
+      </w:pPr>
+      <w:r>
+        <w:t>❌ Evitar abreviações informais</w:t>
+      </w:r>
+    </w:p>
+    <w:p>
+      <w:pPr>
+        <w:pStyle w:val="ListBullet"/>
+        <w:spacing w:after="80"/>
+      </w:pPr>
+      <w:r>
+        <w:t>❌ Evitar termos genéricos como "não funciona" sem detalhamento</w:t>
+      </w:r>
+    </w:p>
+    <w:p>
+      <w:pPr>
+        <w:pStyle w:val="ListBullet"/>
+        <w:spacing w:after="80"/>
+      </w:pPr>
+      <w:r>
+        <w:t>❌ Não inserir letras maiúsculas desnecessárias</w:t>
+      </w:r>
+    </w:p>
+    <w:p>
+      <w:pPr>
+        <w:pStyle w:val="Heading2"/>
+      </w:pPr>
+      <w:r>
+        <w:t>6.2 Exemplos de Descrições</w:t>
+      </w:r>
+    </w:p>
+    <w:p>
+      <w:pPr>
+        <w:pStyle w:val="ListBullet"/>
+        <w:spacing w:after="60"/>
+        <w:ind w:left="461" w:hanging="259"/>
+      </w:pPr>
+      <w:r>
+        <w:t>"O sistema não funciona."</w:t>
+      </w:r>
+    </w:p>
+    <w:p>
+      <w:pPr>
+        <w:pStyle w:val="ListBullet"/>
+        <w:spacing w:after="60"/>
+        <w:ind w:left="461" w:hanging="259"/>
+      </w:pPr>
+      <w:r>
+        <w:t>"Tá dando erro."</w:t>
+      </w:r>
+    </w:p>
+    <w:p>
+      <w:pPr>
+        <w:pStyle w:val="ListBullet"/>
+        <w:spacing w:after="60"/>
+        <w:ind w:left="461" w:hanging="259"/>
+      </w:pPr>
+      <w:r>
+        <w:t>"Não consigo entrar."</w:t>
+      </w:r>
+    </w:p>
+    <w:p>
+      <w:pPr>
+        <w:pStyle w:val="ListBullet"/>
+        <w:spacing w:after="60"/>
+        <w:ind w:left="461" w:hanging="259"/>
+      </w:pPr>
+      <w:r>
+        <w:t>"Problema no computador."</w:t>
+      </w:r>
+    </w:p>
+    <w:p>
+      <w:pPr>
+        <w:pStyle w:val="ListBullet"/>
+        <w:spacing w:after="60"/>
+        <w:ind w:left="461" w:hanging="259"/>
+      </w:pPr>
+      <w:r>
+        <w:t>"Aplicação fora do ar."</w:t>
+      </w:r>
+    </w:p>
+    <w:p>
+      <w:pPr>
+        <w:spacing w:after="80"/>
+      </w:pPr>
+      <w:r>
+        <w:rPr>
+          <w:color w:val="163A63"/>
+        </w:rPr>
+        <w:t>📌 Por que não usar: Essas descrições são genéricas, não informam o sistema afetado, o tipo de erro, nem o contexto do problema, dificultando a análise e a resolução do chamado.</w:t>
+      </w:r>
+    </w:p>
+    <w:p>
+      <w:pPr>
+        <w:pStyle w:val="ListBullet"/>
+        <w:spacing w:after="60"/>
+        <w:ind w:left="461" w:hanging="259"/>
+      </w:pPr>
+      <w:r>
+        <w:t xml:space="preserve">"Ao tentar acessar o sistema </w:t>
+      </w:r>
+      <w:r>
+        <w:rPr>
+          <w:b/>
+        </w:rPr>
+        <w:t>X</w:t>
+      </w:r>
+      <w:r>
+        <w:t xml:space="preserve">, o usuário recebe a mensagem de erro </w:t>
+      </w:r>
+      <w:r>
+        <w:rPr>
+          <w:i/>
+        </w:rPr>
+        <w:t>'acesso não autorizado'</w:t>
+      </w:r>
+      <w:r>
+        <w:t xml:space="preserve"> desde às 9h do dia 12/02."</w:t>
+      </w:r>
+    </w:p>
+    <w:p>
+      <w:pPr>
+        <w:pStyle w:val="ListBullet"/>
+        <w:spacing w:after="60"/>
+        <w:ind w:left="461" w:hanging="259"/>
+      </w:pPr>
+      <w:r>
+        <w:t xml:space="preserve">"O sistema </w:t>
+      </w:r>
+      <w:r>
+        <w:rPr>
+          <w:b/>
+        </w:rPr>
+        <w:t>Y</w:t>
+      </w:r>
+      <w:r>
+        <w:t xml:space="preserve"> apresenta lentidão ao realizar o cadastro de usuários, principalmente no período da manhã."</w:t>
+      </w:r>
+    </w:p>
+    <w:p>
+      <w:pPr>
+        <w:pStyle w:val="ListBullet"/>
+        <w:spacing w:after="60"/>
+        <w:ind w:left="461" w:hanging="259"/>
+      </w:pPr>
+      <w:r>
+        <w:t xml:space="preserve">"Após atualização realizada em 11/02, o módulo </w:t>
+      </w:r>
+      <w:r>
+        <w:rPr>
+          <w:b/>
+        </w:rPr>
+        <w:t>Z</w:t>
+      </w:r>
+      <w:r>
+        <w:t xml:space="preserve"> não permite a finalização de atendimentos."</w:t>
+      </w:r>
+    </w:p>
+    <w:p>
+      <w:pPr>
+        <w:pStyle w:val="ListBullet"/>
+        <w:spacing w:after="60"/>
+        <w:ind w:left="461" w:hanging="259"/>
+      </w:pPr>
+      <w:r>
+        <w:t xml:space="preserve">"O computador da sala </w:t>
+      </w:r>
+      <w:r>
+        <w:rPr>
+          <w:b/>
+        </w:rPr>
+        <w:t>A</w:t>
+      </w:r>
+      <w:r>
+        <w:t xml:space="preserve"> não conecta à rede interna desde o início do expediente."</w:t>
+      </w:r>
+    </w:p>
+    <w:p>
+      <w:pPr>
+        <w:spacing w:after="80"/>
+      </w:pPr>
+      <w:r>
+        <w:rPr>
+          <w:color w:val="163A63"/>
+        </w:rPr>
+        <w:t>📌 Por que usar: Essas descrições são claras, objetivas, indicam o sistema afetado, o comportamento observado e o momento da ocorrência, permitindo um atendimento mais rápido e eficiente.</w:t>
+      </w:r>
+    </w:p>
+    <w:p>
+      <w:pPr>
+        <w:pStyle w:val="Heading2"/>
+      </w:pPr>
+      <w:r>
+        <w:t>6.3 Descrição do Chamado – Boas Práticas</w:t>
+      </w:r>
+    </w:p>
+    <w:p>
+      <w:r>
+        <w:t>A descrição deve conter, sempre que possível:</w:t>
+      </w:r>
+    </w:p>
+    <w:p>
+      <w:pPr>
+        <w:pStyle w:val="ListBullet"/>
+        <w:spacing w:after="80"/>
+      </w:pPr>
+      <w:r>
+        <w:t>🖥️ Sistema ou serviço afetado</w:t>
+      </w:r>
+    </w:p>
+    <w:p>
+      <w:pPr>
+        <w:pStyle w:val="ListBullet"/>
+        <w:spacing w:after="80"/>
+      </w:pPr>
+      <w:r>
+        <w:t>📝 Descrição clara do problema ou solicitação</w:t>
+      </w:r>
+    </w:p>
+    <w:p>
+      <w:pPr>
+        <w:pStyle w:val="ListBullet"/>
+        <w:spacing w:after="80"/>
+      </w:pPr>
+      <w:r>
+        <w:t>📅 Quando o problema ocorreu</w:t>
+      </w:r>
+    </w:p>
+    <w:p>
+      <w:pPr>
+        <w:pStyle w:val="ListBullet"/>
+        <w:spacing w:after="80"/>
+      </w:pPr>
+      <w:r>
+        <w:t>🔁 Se o erro é recorrente ou pontual</w:t>
+      </w:r>
+    </w:p>
+    <w:p>
+      <w:pPr>
+        <w:pStyle w:val="ListBullet"/>
+        <w:spacing w:after="80"/>
+      </w:pPr>
+      <w:r>
+        <w:t>📸 Prints de tela ou evidências (quando aplicável)</w:t>
+      </w:r>
+    </w:p>
+    <w:p>
+      <w:pPr>
+        <w:pStyle w:val="Heading2"/>
+      </w:pPr>
+      <w:r>
+        <w:t>6.4 Passo a Passo por Tipo de Solicitação</w:t>
+      </w:r>
+    </w:p>
+    <w:p>
+      <w:r>
+        <w:t>Para cada chamado, a equipe deve identificar o tipo de solicitação e seguir um fluxo básico de tratamento. O objetivo é evitar registros incompletos, retrabalho e encaminhamentos desnecessários.</w:t>
+      </w:r>
+    </w:p>
+    <w:p>
+      <w:pPr>
+        <w:pStyle w:val="Heading3"/>
+      </w:pPr>
+      <w:r>
+        <w:t>Cadastro, liberação ou alteração de acesso</w:t>
+      </w:r>
+    </w:p>
+    <w:p>
+      <w:pPr>
+        <w:pStyle w:val="ListBullet"/>
+        <w:spacing w:after="60"/>
+        <w:ind w:left="461" w:hanging="259"/>
+      </w:pPr>
+      <w:r>
+        <w:t>Conferir nome completo, CPF ou matrícula, unidade, função e sistema solicitado.</w:t>
+      </w:r>
+    </w:p>
+    <w:p>
+      <w:pPr>
+        <w:pStyle w:val="ListBullet"/>
+        <w:spacing w:after="60"/>
+        <w:ind w:left="461" w:hanging="259"/>
+      </w:pPr>
+      <w:r>
+        <w:t>Validar se há autorização da chefia ou responsável pela unidade, quando aplicável.</w:t>
+      </w:r>
+    </w:p>
+    <w:p>
+      <w:pPr>
+        <w:pStyle w:val="ListBullet"/>
+        <w:spacing w:after="60"/>
+        <w:ind w:left="461" w:hanging="259"/>
+      </w:pPr>
+      <w:r>
+        <w:t>Executar o cadastro ou alteração quando o serviço estiver previsto para a Central de Serviços.</w:t>
+      </w:r>
+    </w:p>
+    <w:p>
+      <w:pPr>
+        <w:pStyle w:val="ListBullet"/>
+        <w:spacing w:after="60"/>
+        <w:ind w:left="461" w:hanging="259"/>
+      </w:pPr>
+      <w:r>
+        <w:t>Registrar no chamado quais usuários foram atendidos e qual acesso foi concedido.</w:t>
+      </w:r>
+    </w:p>
+    <w:p>
+      <w:pPr>
+        <w:pStyle w:val="Heading3"/>
+      </w:pPr>
+      <w:r>
+        <w:t>Erro de sistema</w:t>
+      </w:r>
+    </w:p>
+    <w:p>
+      <w:pPr>
+        <w:pStyle w:val="ListBullet"/>
+        <w:spacing w:after="60"/>
+        <w:ind w:left="461" w:hanging="259"/>
+      </w:pPr>
+      <w:r>
+        <w:t>Identificar sistema, módulo, tela, mensagem de erro e horário da ocorrência.</w:t>
+      </w:r>
+    </w:p>
+    <w:p>
+      <w:pPr>
+        <w:pStyle w:val="ListBullet"/>
+        <w:spacing w:after="60"/>
+        <w:ind w:left="461" w:hanging="259"/>
+      </w:pPr>
+      <w:r>
+        <w:t>Solicitar evidência, como print ou descrição do passo que gerou o erro.</w:t>
+      </w:r>
+    </w:p>
+    <w:p>
+      <w:pPr>
+        <w:pStyle w:val="ListBullet"/>
+        <w:spacing w:after="60"/>
+        <w:ind w:left="461" w:hanging="259"/>
+      </w:pPr>
+      <w:r>
+        <w:t>Verificar se é caso isolado ou se afeta outros usuários/unidades.</w:t>
+      </w:r>
+    </w:p>
+    <w:p>
+      <w:pPr>
+        <w:pStyle w:val="ListBullet"/>
+        <w:spacing w:after="60"/>
+        <w:ind w:left="461" w:hanging="259"/>
+      </w:pPr>
+      <w:r>
+        <w:t>Escalonar para N2/N3 quando exigir análise técnica, correção ou intervenção sistêmica.</w:t>
+      </w:r>
+    </w:p>
+    <w:p>
+      <w:pPr>
+        <w:pStyle w:val="Heading3"/>
+      </w:pPr>
+      <w:r>
+        <w:t>Equipamento, rede ou infraestrutura</w:t>
+      </w:r>
+    </w:p>
+    <w:p>
+      <w:pPr>
+        <w:pStyle w:val="ListBullet"/>
+        <w:spacing w:after="60"/>
+        <w:ind w:left="461" w:hanging="259"/>
+      </w:pPr>
+      <w:r>
+        <w:t>Identificar patrimônio, setor, unidade, ponto de rede e telefone de contato.</w:t>
+      </w:r>
+    </w:p>
+    <w:p>
+      <w:pPr>
+        <w:pStyle w:val="ListBullet"/>
+        <w:spacing w:after="60"/>
+        <w:ind w:left="461" w:hanging="259"/>
+      </w:pPr>
+      <w:r>
+        <w:t>Registrar sintomas objetivos: sem rede, sem impressão, lentidão, tela apagada, travamento.</w:t>
+      </w:r>
+    </w:p>
+    <w:p>
+      <w:pPr>
+        <w:pStyle w:val="ListBullet"/>
+        <w:spacing w:after="60"/>
+        <w:ind w:left="461" w:hanging="259"/>
+      </w:pPr>
+      <w:r>
+        <w:t>Orientar testes simples quando possível, como reiniciar equipamento ou verificar cabos.</w:t>
+      </w:r>
+    </w:p>
+    <w:p>
+      <w:pPr>
+        <w:pStyle w:val="ListBullet"/>
+        <w:spacing w:after="60"/>
+        <w:ind w:left="461" w:hanging="259"/>
+      </w:pPr>
+      <w:r>
+        <w:t>Encaminhar para a equipe responsável quando houver necessidade de visita ou manutenção.</w:t>
+      </w:r>
+    </w:p>
+    <w:p>
+      <w:pPr>
+        <w:pStyle w:val="Heading3"/>
+      </w:pPr>
+      <w:r>
+        <w:t>Dúvida, orientação ou solicitação administrativa</w:t>
+      </w:r>
+    </w:p>
+    <w:p>
+      <w:pPr>
+        <w:pStyle w:val="ListBullet"/>
+        <w:spacing w:after="60"/>
+        <w:ind w:left="461" w:hanging="259"/>
+      </w:pPr>
+      <w:r>
+        <w:t>Confirmar qual procedimento o usuário precisa executar.</w:t>
+      </w:r>
+    </w:p>
+    <w:p>
+      <w:pPr>
+        <w:pStyle w:val="ListBullet"/>
+        <w:spacing w:after="60"/>
+        <w:ind w:left="461" w:hanging="259"/>
+      </w:pPr>
+      <w:r>
+        <w:t>Orientar com base em POP, manual ou script oficial, sempre que houver documento publicado.</w:t>
+      </w:r>
+    </w:p>
+    <w:p>
+      <w:pPr>
+        <w:pStyle w:val="ListBullet"/>
+        <w:spacing w:after="60"/>
+        <w:ind w:left="461" w:hanging="259"/>
+      </w:pPr>
+      <w:r>
+        <w:t>Registrar a orientação prestada no histórico do chamado.</w:t>
+      </w:r>
+    </w:p>
+    <w:p>
+      <w:pPr>
+        <w:pStyle w:val="ListBullet"/>
+        <w:spacing w:after="60"/>
+        <w:ind w:left="461" w:hanging="259"/>
+      </w:pPr>
+      <w:r>
+        <w:t>Encerrar somente após deixar claro o encaminhamento ou a resposta fornecida.</w:t>
+      </w:r>
+    </w:p>
+    <w:p>
+      <w:pPr>
+        <w:pStyle w:val="Heading2"/>
+      </w:pPr>
+      <w:r>
+        <w:t>6.5 O que é Demanda Simples e Padronizada para a Central de Serviços?</w:t>
+      </w:r>
+    </w:p>
+    <w:p>
+      <w:r>
+        <w:t xml:space="preserve">Considera-se </w:t>
+      </w:r>
+      <w:r>
+        <w:rPr>
+          <w:b/>
+        </w:rPr>
+        <w:t>demanda simples e padronizada</w:t>
+      </w:r>
+      <w:r>
+        <w:t xml:space="preserve"> aquela que possui procedimento conhecido, baixo risco operacional, informações suficientes no chamado e não exige análise técnica aprofundada, alteração estrutural, desenvolvimento, correção de sistema ou decisão de gestão.</w:t>
+      </w:r>
+    </w:p>
+    <w:p>
+      <w:pPr>
+        <w:pStyle w:val="Heading3"/>
+      </w:pPr>
+      <w:r>
+        <w:t>Exemplos que a Central de Serviços pode atender</w:t>
+      </w:r>
+    </w:p>
+    <w:p>
+      <w:pPr>
+        <w:pStyle w:val="ListBullet"/>
+        <w:spacing w:after="60"/>
+        <w:ind w:left="461" w:hanging="259"/>
+      </w:pPr>
+      <w:r>
+        <w:t>Cadastro de usuário em sistema com dados completos e autorização informada.</w:t>
+      </w:r>
+    </w:p>
+    <w:p>
+      <w:pPr>
+        <w:pStyle w:val="ListBullet"/>
+        <w:spacing w:after="60"/>
+        <w:ind w:left="461" w:hanging="259"/>
+      </w:pPr>
+      <w:r>
+        <w:t>Reset de senha ou desbloqueio de acesso, conforme regra do serviço.</w:t>
+      </w:r>
+    </w:p>
+    <w:p>
+      <w:pPr>
+        <w:pStyle w:val="ListBullet"/>
+        <w:spacing w:after="60"/>
+        <w:ind w:left="461" w:hanging="259"/>
+      </w:pPr>
+      <w:r>
+        <w:t>Atualização simples de dados cadastrais, quando prevista no catálogo.</w:t>
+      </w:r>
+    </w:p>
+    <w:p>
+      <w:pPr>
+        <w:pStyle w:val="ListBullet"/>
+        <w:spacing w:after="60"/>
+        <w:ind w:left="461" w:hanging="259"/>
+      </w:pPr>
+      <w:r>
+        <w:t>Orientação de uso baseada em manual, POP ou script já validado.</w:t>
+      </w:r>
+    </w:p>
+    <w:p>
+      <w:pPr>
+        <w:pStyle w:val="ListBullet"/>
+        <w:spacing w:after="60"/>
+        <w:ind w:left="461" w:hanging="259"/>
+      </w:pPr>
+      <w:r>
+        <w:t>Triagem e correção de informação incompleta antes do encaminhamento.</w:t>
+      </w:r>
+    </w:p>
+    <w:p>
+      <w:pPr>
+        <w:pStyle w:val="Heading3"/>
+      </w:pPr>
+      <w:r>
+        <w:t>Quando não é da Central de Serviços</w:t>
+      </w:r>
+    </w:p>
+    <w:p>
+      <w:pPr>
+        <w:pStyle w:val="ListBullet"/>
+        <w:spacing w:after="60"/>
+        <w:ind w:left="461" w:hanging="259"/>
+      </w:pPr>
+      <w:r>
+        <w:t>Erro sem causa conhecida ou que exige análise em banco, servidor ou código.</w:t>
+      </w:r>
+    </w:p>
+    <w:p>
+      <w:pPr>
+        <w:pStyle w:val="ListBullet"/>
+        <w:spacing w:after="60"/>
+        <w:ind w:left="461" w:hanging="259"/>
+      </w:pPr>
+      <w:r>
+        <w:t>Solicitação sem autorização obrigatória ou com conflito de regra de negócio.</w:t>
+      </w:r>
+    </w:p>
+    <w:p>
+      <w:pPr>
+        <w:pStyle w:val="ListBullet"/>
+        <w:spacing w:after="60"/>
+        <w:ind w:left="461" w:hanging="259"/>
+      </w:pPr>
+      <w:r>
+        <w:t>Incidente que afeta vários usuários, unidade inteira ou serviço crítico.</w:t>
+      </w:r>
+    </w:p>
+    <w:p>
+      <w:pPr>
+        <w:pStyle w:val="ListBullet"/>
+        <w:spacing w:after="60"/>
+        <w:ind w:left="461" w:hanging="259"/>
+      </w:pPr>
+      <w:r>
+        <w:t>Criação de nova funcionalidade, relatório, integração ou mudança de fluxo.</w:t>
+      </w:r>
+    </w:p>
+    <w:p>
+      <w:pPr>
+        <w:pStyle w:val="ListBullet"/>
+        <w:spacing w:after="60"/>
+        <w:ind w:left="461" w:hanging="259"/>
+      </w:pPr>
+      <w:r>
+        <w:t>Manutenção física, visita técnica ou intervenção especializada.</w:t>
+      </w:r>
+    </w:p>
+    <w:p>
+      <w:pPr>
+        <w:spacing w:after="80"/>
+      </w:pPr>
+      <w:r>
+        <w:rPr>
+          <w:color w:val="163A63"/>
+        </w:rPr>
+        <w:t>Critério prático: se o atendente consegue resolver seguindo um procedimento já documentado, com dados completos e sem precisar investigar causa técnica, a demanda tende a ser da Central de Serviços. Se precisar analisar, decidir, corrigir estrutura ou envolver especialista, deve ser escalonada.</w:t>
+      </w:r>
+    </w:p>
+    <w:p>
+      <w:pPr>
+        <w:pStyle w:val="Heading2"/>
+      </w:pPr>
+      <w:r>
+        <w:t>6.6 Um Chamado ou Vários Chamados?</w:t>
+      </w:r>
+    </w:p>
+    <w:p>
+      <w:pPr>
+        <w:pStyle w:val="Heading3"/>
+      </w:pPr>
+      <w:r>
+        <w:t>Um chamado</w:t>
+      </w:r>
+    </w:p>
+    <w:p>
+      <w:pPr>
+        <w:pStyle w:val="ListBullet"/>
+        <w:spacing w:after="60"/>
+        <w:ind w:left="461" w:hanging="259"/>
+      </w:pPr>
+      <w:r>
+        <w:t>Uma chefia solicita cadastro de 12 profissionais no mesmo sistema, para a mesma unidade e com o mesmo perfil de acesso.</w:t>
+      </w:r>
+    </w:p>
+    <w:p>
+      <w:pPr>
+        <w:pStyle w:val="ListBullet"/>
+        <w:spacing w:after="60"/>
+        <w:ind w:left="461" w:hanging="259"/>
+      </w:pPr>
+      <w:r>
+        <w:t>Um setor solicita reset de senha para 5 usuários do mesmo sistema, todos listados no chamado.</w:t>
+      </w:r>
+    </w:p>
+    <w:p>
+      <w:pPr>
+        <w:pStyle w:val="ListBullet"/>
+        <w:spacing w:after="60"/>
+        <w:ind w:left="461" w:hanging="259"/>
+      </w:pPr>
+      <w:r>
+        <w:t>Uma unidade pede liberação do mesmo módulo para uma equipe específica, com autorização única da chefia.</w:t>
+      </w:r>
+    </w:p>
+    <w:p>
+      <w:pPr>
+        <w:pStyle w:val="Heading3"/>
+      </w:pPr>
+      <w:r>
+        <w:t>Chamados separados</w:t>
+      </w:r>
+    </w:p>
+    <w:p>
+      <w:pPr>
+        <w:pStyle w:val="ListBullet"/>
+        <w:spacing w:after="60"/>
+        <w:ind w:left="461" w:hanging="259"/>
+      </w:pPr>
+      <w:r>
+        <w:t>O solicitante pede cadastro de profissionais em sistemas diferentes, como SEI, CNES e PEC.</w:t>
+      </w:r>
+    </w:p>
+    <w:p>
+      <w:pPr>
+        <w:pStyle w:val="ListBullet"/>
+        <w:spacing w:after="60"/>
+        <w:ind w:left="461" w:hanging="259"/>
+      </w:pPr>
+      <w:r>
+        <w:t>A lista mistura unidades diferentes, perfis de acesso diferentes ou autorizações distintas.</w:t>
+      </w:r>
+    </w:p>
+    <w:p>
+      <w:pPr>
+        <w:pStyle w:val="ListBullet"/>
+        <w:spacing w:after="60"/>
+        <w:ind w:left="461" w:hanging="259"/>
+      </w:pPr>
+      <w:r>
+        <w:t>Parte da demanda é cadastro, outra parte é correção de erro, desbloqueio ou alteração de perfil.</w:t>
+      </w:r>
+    </w:p>
+    <w:p>
+      <w:pPr>
+        <w:pStyle w:val="ListBullet"/>
+        <w:spacing w:after="60"/>
+        <w:ind w:left="461" w:hanging="259"/>
+      </w:pPr>
+      <w:r>
+        <w:t>Cada profissional apresenta um problema específico que exige análise individual.</w:t>
+      </w:r>
+    </w:p>
+    <w:p>
+      <w:pPr>
+        <w:pStyle w:val="Heading1"/>
+      </w:pPr>
+      <w:r>
+        <w:t>Processo 3 - Categorização do Chamado e Templates</w:t>
+      </w:r>
+    </w:p>
+    <w:p>
+      <w:r>
+        <w:t xml:space="preserve">O GLPI foi configurado com </w:t>
+      </w:r>
+      <w:r>
+        <w:rPr>
+          <w:b/>
+        </w:rPr>
+        <w:t>templates específicos para cada serviço</w:t>
+      </w:r>
+      <w:r>
+        <w:t xml:space="preserve">, que são carregados automaticamente no momento em que o usuário realiza a </w:t>
+      </w:r>
+      <w:r>
+        <w:rPr>
+          <w:b/>
+        </w:rPr>
+        <w:t>categorização do chamado</w:t>
+      </w:r>
+      <w:r>
+        <w:t>. Cada tipo de serviço possui um template próprio, adequado às suas particularidades e necessidades de atendimento.</w:t>
+      </w:r>
+    </w:p>
+    <w:p>
+      <w:r>
+        <w:t xml:space="preserve">Embora os templates sejam diferentes conforme o serviço selecionado, </w:t>
+      </w:r>
+      <w:r>
+        <w:rPr>
+          <w:b/>
+        </w:rPr>
+        <w:t>todos possuem campos obrigatórios em comum</w:t>
+      </w:r>
+      <w:r>
+        <w:t>:</w:t>
+      </w:r>
+    </w:p>
+    <w:p>
+      <w:pPr>
+        <w:pStyle w:val="ListBullet"/>
+        <w:spacing w:after="80"/>
+      </w:pPr>
+      <w:r>
+        <w:t>👤 Nome — identificação do solicitante</w:t>
+      </w:r>
+    </w:p>
+    <w:p>
+      <w:pPr>
+        <w:pStyle w:val="ListBullet"/>
+        <w:spacing w:after="80"/>
+      </w:pPr>
+      <w:r>
+        <w:t>📞 Telefone — contato para comunicação durante o atendimento</w:t>
+      </w:r>
+    </w:p>
+    <w:p>
+      <w:pPr>
+        <w:pStyle w:val="ListBullet"/>
+        <w:spacing w:after="80"/>
+      </w:pPr>
+      <w:r>
+        <w:t>📧 E-mail — essencial para o envio das notificações automáticas</w:t>
+      </w:r>
+    </w:p>
+    <w:p>
+      <w:pPr>
+        <w:pStyle w:val="ListBullet"/>
+        <w:spacing w:after="60"/>
+        <w:ind w:left="461" w:hanging="259"/>
+      </w:pPr>
+      <w:r>
+        <w:t xml:space="preserve">Ao selecionar o serviço </w:t>
+      </w:r>
+      <w:r>
+        <w:rPr>
+          <w:b/>
+        </w:rPr>
+        <w:t>"SEI"</w:t>
+      </w:r>
+      <w:r>
+        <w:t xml:space="preserve">, o GLPI carrega um template específico com campos técnicos adicionais. Apesar das diferenças, os campos </w:t>
+      </w:r>
+      <w:r>
+        <w:rPr>
+          <w:b/>
+        </w:rPr>
+        <w:t>Nome, Telefone e E-mail</w:t>
+      </w:r>
+      <w:r>
+        <w:t xml:space="preserve"> estarão sempre presentes e são de preenchimento obrigatório.</w:t>
+      </w:r>
+    </w:p>
+    <w:p>
+      <w:pPr>
+        <w:spacing w:after="80"/>
+      </w:pPr>
+      <w:r>
+        <w:rPr>
+          <w:color w:val="163A63"/>
+        </w:rPr>
+        <w:t>📌 Atenção: O correto preenchimento desses campos é essencial para garantir a identificação do solicitante, a comunicação durante o atendimento e o adequado encaminhamento do chamado.</w:t>
+      </w:r>
+    </w:p>
+    <w:p>
+      <w:pPr>
+        <w:pStyle w:val="Heading1"/>
+      </w:pPr>
+      <w:r>
+        <w:t>Processo 4 - Papéis, Níveis e Escalonamento</w:t>
+      </w:r>
+    </w:p>
+    <w:p>
+      <w:r>
+        <w:t xml:space="preserve">Os papéis e responsabilidades das equipes estão alinhados ao </w:t>
+      </w:r>
+      <w:r>
+        <w:rPr>
+          <w:b/>
+        </w:rPr>
+        <w:t>Catálogo de Serviços</w:t>
+      </w:r>
+      <w:r>
+        <w:t xml:space="preserve"> e às boas práticas de </w:t>
+      </w:r>
+      <w:r>
+        <w:rPr>
+          <w:b/>
+        </w:rPr>
+        <w:t>governança ITIL</w:t>
+      </w:r>
+      <w:r>
+        <w:t>, garantindo clareza na atuação de cada nível de atendimento e adequada gestão das demandas.</w:t>
+      </w:r>
+    </w:p>
+    <w:p>
+      <w:pPr>
+        <w:pStyle w:val="ListBullet"/>
+        <w:spacing w:after="60"/>
+        <w:ind w:left="461" w:hanging="259"/>
+      </w:pPr>
+      <w:r>
+        <w:t>Realizar o atendimento inicial ao usuário, conferindo dados obrigatórios e contexto da solicitação</w:t>
+      </w:r>
+    </w:p>
+    <w:p>
+      <w:pPr>
+        <w:pStyle w:val="ListBullet"/>
+        <w:spacing w:after="60"/>
+        <w:ind w:left="461" w:hanging="259"/>
+      </w:pPr>
+      <w:r>
+        <w:t>Registrar corretamente as informações no GLPI, incluindo sistema, unidade, contato, evidências e autorização quando aplicável</w:t>
+      </w:r>
+    </w:p>
+    <w:p>
+      <w:pPr>
+        <w:pStyle w:val="ListBullet"/>
+        <w:spacing w:after="60"/>
+        <w:ind w:left="461" w:hanging="259"/>
+      </w:pPr>
+      <w:r>
+        <w:t>Resolver e encerrar demandas simples e padronizadas, conforme catálogo, POP, manual ou script oficial</w:t>
+      </w:r>
+    </w:p>
+    <w:p>
+      <w:pPr>
+        <w:pStyle w:val="ListBullet"/>
+        <w:spacing w:after="60"/>
+        <w:ind w:left="461" w:hanging="259"/>
+      </w:pPr>
+      <w:r>
+        <w:t>Orientar o usuário quando houver procedimento documentado e registrar a orientação no histórico</w:t>
+      </w:r>
+    </w:p>
+    <w:p>
+      <w:pPr>
+        <w:pStyle w:val="ListBullet"/>
+        <w:spacing w:after="60"/>
+        <w:ind w:left="461" w:hanging="259"/>
+      </w:pPr>
+      <w:r>
+        <w:t>Escalonar o chamado quando ultrapassar seu escopo de atuação, descrevendo o motivo do encaminhamento e as verificações já realizadas</w:t>
+      </w:r>
+    </w:p>
+    <w:p>
+      <w:pPr>
+        <w:spacing w:after="80"/>
+      </w:pPr>
+      <w:r>
+        <w:rPr>
+          <w:color w:val="163A63"/>
+        </w:rPr>
+        <w:t>Resumo da Central de Serviços: atende o que é repetível, documentado e de baixo risco. Não deve assumir demandas que dependam de investigação técnica, alteração estrutural, regra de negócio não validada ou autorização ausente.</w:t>
+      </w:r>
+    </w:p>
+    <w:p>
+      <w:pPr>
+        <w:pStyle w:val="ListBullet"/>
+        <w:spacing w:after="60"/>
+        <w:ind w:left="461" w:hanging="259"/>
+      </w:pPr>
+      <w:r>
+        <w:t>Atender demandas técnicas de sistemas escalonadas pela Central de Serviços que exigem atendimento presencial na unidade</w:t>
+      </w:r>
+    </w:p>
+    <w:p>
+      <w:pPr>
+        <w:pStyle w:val="ListBullet"/>
+        <w:spacing w:after="60"/>
+        <w:ind w:left="461" w:hanging="259"/>
+      </w:pPr>
+      <w:r>
+        <w:t>Realizar implantação, configuração e ajustes de sistemas em campo</w:t>
+      </w:r>
+    </w:p>
+    <w:p>
+      <w:pPr>
+        <w:pStyle w:val="ListBullet"/>
+        <w:spacing w:after="60"/>
+        <w:ind w:left="461" w:hanging="259"/>
+      </w:pPr>
+      <w:r>
+        <w:t>Realizar análises mais aprofundadas de erros e falhas de sistema</w:t>
+      </w:r>
+    </w:p>
+    <w:p>
+      <w:pPr>
+        <w:pStyle w:val="ListBullet"/>
+        <w:spacing w:after="60"/>
+        <w:ind w:left="461" w:hanging="259"/>
+      </w:pPr>
+      <w:r>
+        <w:t>Apoiar tecnicamente a Central de Serviços</w:t>
+      </w:r>
+    </w:p>
+    <w:p>
+      <w:pPr>
+        <w:pStyle w:val="ListBullet"/>
+        <w:spacing w:after="60"/>
+        <w:ind w:left="461" w:hanging="259"/>
+      </w:pPr>
+      <w:r>
+        <w:t>Registrar detalhadamente as ações executadas no chamado</w:t>
+      </w:r>
+    </w:p>
+    <w:p>
+      <w:pPr>
+        <w:pStyle w:val="ListBullet"/>
+        <w:spacing w:after="60"/>
+        <w:ind w:left="461" w:hanging="259"/>
+      </w:pPr>
+      <w:r>
+        <w:t>Atender demandas de equipamento, rede e infraestrutura escalonadas pela Central de Serviços que exigem visita técnica</w:t>
+      </w:r>
+    </w:p>
+    <w:p>
+      <w:pPr>
+        <w:pStyle w:val="ListBullet"/>
+        <w:spacing w:after="60"/>
+        <w:ind w:left="461" w:hanging="259"/>
+      </w:pPr>
+      <w:r>
+        <w:t>Realizar manutenção, substituição ou configuração de ativos de TI (computadores, impressoras, pontos de rede, entre outros)</w:t>
+      </w:r>
+    </w:p>
+    <w:p>
+      <w:pPr>
+        <w:pStyle w:val="ListBullet"/>
+        <w:spacing w:after="60"/>
+        <w:ind w:left="461" w:hanging="259"/>
+      </w:pPr>
+      <w:r>
+        <w:t>Diagnosticar problemas físicos de hardware e conectividade</w:t>
+      </w:r>
+    </w:p>
+    <w:p>
+      <w:pPr>
+        <w:pStyle w:val="ListBullet"/>
+        <w:spacing w:after="60"/>
+        <w:ind w:left="461" w:hanging="259"/>
+      </w:pPr>
+      <w:r>
+        <w:t>Registrar detalhadamente as ações executadas no chamado</w:t>
+      </w:r>
+    </w:p>
+    <w:p>
+      <w:pPr>
+        <w:pStyle w:val="ListBullet"/>
+        <w:spacing w:after="60"/>
+        <w:ind w:left="461" w:hanging="259"/>
+      </w:pPr>
+      <w:r>
+        <w:t>Atender demandas técnicas de sistemas escalonadas pela Central de Serviços que podem ser resolvidas remotamente, sem necessidade de deslocamento</w:t>
+      </w:r>
+    </w:p>
+    <w:p>
+      <w:pPr>
+        <w:pStyle w:val="ListBullet"/>
+        <w:spacing w:after="60"/>
+        <w:ind w:left="461" w:hanging="259"/>
+      </w:pPr>
+      <w:r>
+        <w:t>Realizar análises mais aprofundadas e apoiar tecnicamente a Central de Serviços</w:t>
+      </w:r>
+    </w:p>
+    <w:p>
+      <w:pPr>
+        <w:pStyle w:val="ListBullet"/>
+        <w:spacing w:after="60"/>
+        <w:ind w:left="461" w:hanging="259"/>
+      </w:pPr>
+      <w:r>
+        <w:t>Validar informações, coordenar encaminhamentos e apoiar outros níveis quando necessário</w:t>
+      </w:r>
+    </w:p>
+    <w:p>
+      <w:pPr>
+        <w:pStyle w:val="ListBullet"/>
+        <w:spacing w:after="60"/>
+        <w:ind w:left="461" w:hanging="259"/>
+      </w:pPr>
+      <w:r>
+        <w:t>Registrar detalhadamente as ações executadas no chamado</w:t>
+      </w:r>
+    </w:p>
+    <w:p>
+      <w:pPr>
+        <w:pStyle w:val="ListBullet"/>
+        <w:spacing w:after="60"/>
+        <w:ind w:left="461" w:hanging="259"/>
+      </w:pPr>
+      <w:r>
+        <w:t>Atuar em demandas especializadas e críticas</w:t>
+      </w:r>
+    </w:p>
+    <w:p>
+      <w:pPr>
+        <w:pStyle w:val="ListBullet"/>
+        <w:spacing w:after="60"/>
+        <w:ind w:left="461" w:hanging="259"/>
+      </w:pPr>
+      <w:r>
+        <w:t>Executar correções estruturais</w:t>
+      </w:r>
+    </w:p>
+    <w:p>
+      <w:pPr>
+        <w:pStyle w:val="ListBullet"/>
+        <w:spacing w:after="60"/>
+        <w:ind w:left="461" w:hanging="259"/>
+      </w:pPr>
+      <w:r>
+        <w:t>Realizar análises de causa raiz</w:t>
+      </w:r>
+    </w:p>
+    <w:p>
+      <w:pPr>
+        <w:pStyle w:val="ListBullet"/>
+        <w:spacing w:after="60"/>
+        <w:ind w:left="461" w:hanging="259"/>
+      </w:pPr>
+      <w:r>
+        <w:t>Apoiar tecnicamente os demais níveis quando necessário</w:t>
+      </w:r>
+    </w:p>
+    <w:p>
+      <w:pPr>
+        <w:pStyle w:val="Heading1"/>
+      </w:pPr>
+      <w:r>
+        <w:t>Histórico de Revisão</w:t>
       </w:r>
     </w:p>
     <w:tbl>
@@ -230,1572 +2022,6 @@
       <w:pPr>
         <w:spacing w:after="40"/>
       </w:pPr>
-    </w:p>
-    <w:p>
-      <w:pPr>
-        <w:pStyle w:val="Heading1"/>
-      </w:pPr>
-      <w:r>
-        <w:t>02 Apresentação</w:t>
-      </w:r>
-    </w:p>
-    <w:p>
-      <w:r>
-        <w:t xml:space="preserve">Este Processo Operacional tem como finalidade orientar usuários e equipes da GTIC quanto à correta abertura, registro, categorização e tratamento de chamados no sistema </w:t>
-      </w:r>
-      <w:r>
-        <w:rPr>
-          <w:b/>
-        </w:rPr>
-        <w:t>GLPI</w:t>
-      </w:r>
-      <w:r>
-        <w:t>, considerando as melhorias implementadas no fluxo de atendimento.</w:t>
-      </w:r>
-    </w:p>
-    <w:p>
-      <w:r>
-        <w:t xml:space="preserve">O documento foi elaborado a partir de estudo técnico, análise operacional e amadurecimento do uso da ferramenta, estando alinhado às necessidades institucionais e às boas práticas de Governança de TI, especialmente aos referenciais da </w:t>
-      </w:r>
-      <w:r>
-        <w:rPr>
-          <w:b/>
-        </w:rPr>
-        <w:t>ITIL</w:t>
-      </w:r>
-      <w:r>
-        <w:t>.</w:t>
-      </w:r>
-    </w:p>
-    <w:p>
-      <w:r>
-        <w:t xml:space="preserve">A padronização aqui estabelecida visa assegurar </w:t>
-      </w:r>
-      <w:r>
-        <w:rPr>
-          <w:b/>
-        </w:rPr>
-        <w:t>transparência</w:t>
-      </w:r>
-      <w:r>
-        <w:t xml:space="preserve">, </w:t>
-      </w:r>
-      <w:r>
-        <w:rPr>
-          <w:b/>
-        </w:rPr>
-        <w:t>rastreabilidade</w:t>
-      </w:r>
-      <w:r>
-        <w:t xml:space="preserve">, </w:t>
-      </w:r>
-      <w:r>
-        <w:rPr>
-          <w:b/>
-        </w:rPr>
-        <w:t>qualidade das informações</w:t>
-      </w:r>
-      <w:r>
-        <w:t xml:space="preserve"> e </w:t>
-      </w:r>
-      <w:r>
-        <w:rPr>
-          <w:b/>
-        </w:rPr>
-        <w:t>melhoria contínua</w:t>
-      </w:r>
-      <w:r>
-        <w:t xml:space="preserve"> dos serviços prestados.</w:t>
-      </w:r>
-    </w:p>
-    <w:p>
-      <w:pPr>
-        <w:pStyle w:val="Heading1"/>
-      </w:pPr>
-      <w:r>
-        <w:t>03 Finalidade</w:t>
-      </w:r>
-    </w:p>
-    <w:p>
-      <w:r>
-        <w:t xml:space="preserve">Estabelecer diretrizes, padrões e responsabilidades para a abertura, registro, categorização, atendimento e escalonamento de chamados no sistema GLPI, garantindo </w:t>
-      </w:r>
-      <w:r>
-        <w:rPr>
-          <w:b/>
-        </w:rPr>
-        <w:t>padronização</w:t>
-      </w:r>
-      <w:r>
-        <w:t xml:space="preserve">, </w:t>
-      </w:r>
-      <w:r>
-        <w:rPr>
-          <w:b/>
-        </w:rPr>
-        <w:t>transparência</w:t>
-      </w:r>
-      <w:r>
-        <w:t xml:space="preserve">, </w:t>
-      </w:r>
-      <w:r>
-        <w:rPr>
-          <w:b/>
-        </w:rPr>
-        <w:t>rastreabilidade</w:t>
-      </w:r>
-      <w:r>
-        <w:t xml:space="preserve"> e </w:t>
-      </w:r>
-      <w:r>
-        <w:rPr>
-          <w:b/>
-        </w:rPr>
-        <w:t>qualidade</w:t>
-      </w:r>
-      <w:r>
-        <w:t xml:space="preserve"> na prestação dos serviços de Tecnologia da Informação.</w:t>
-      </w:r>
-    </w:p>
-    <w:p>
-      <w:pPr>
-        <w:pStyle w:val="Heading1"/>
-      </w:pPr>
-      <w:r>
-        <w:t>04 Visão Geral do Processo de Atendimento no GLPI</w:t>
-      </w:r>
-    </w:p>
-    <w:p>
-      <w:r>
-        <w:t xml:space="preserve">A partir da abertura de um chamado no GLPI, o usuário recebe notificação automática por e-mail no momento da </w:t>
-      </w:r>
-      <w:r>
-        <w:rPr>
-          <w:b/>
-        </w:rPr>
-        <w:t>abertura</w:t>
-      </w:r>
-      <w:r>
-        <w:t xml:space="preserve"> e no momento do </w:t>
-      </w:r>
-      <w:r>
-        <w:rPr>
-          <w:b/>
-        </w:rPr>
-        <w:t>encerramento</w:t>
-      </w:r>
-      <w:r>
-        <w:t>.</w:t>
-      </w:r>
-    </w:p>
-    <w:p>
-      <w:r>
-        <w:t xml:space="preserve">Essas notificações visam ampliar a </w:t>
-      </w:r>
-      <w:r>
-        <w:rPr>
-          <w:b/>
-        </w:rPr>
-        <w:t>transparência do atendimento</w:t>
-      </w:r>
-      <w:r>
-        <w:t xml:space="preserve"> e fortalecer a cultura de </w:t>
-      </w:r>
-      <w:r>
-        <w:rPr>
-          <w:b/>
-        </w:rPr>
-        <w:t>qualidade e melhoria contínua</w:t>
-      </w:r>
-      <w:r>
-        <w:t>.</w:t>
-      </w:r>
-    </w:p>
-    <w:p>
-      <w:pPr>
-        <w:pStyle w:val="Heading1"/>
-      </w:pPr>
-      <w:r>
-        <w:t>FLUXO Fluxo resumido do atendimento</w:t>
-      </w:r>
-    </w:p>
-    <w:p>
-      <w:pPr>
-        <w:spacing w:after="80"/>
-      </w:pPr>
-      <w:r>
-        <w:t>1. Receber A Central de Serviços coleta os dados e identifica a necessidade apresentada.</w:t>
-      </w:r>
-    </w:p>
-    <w:p>
-      <w:pPr>
-        <w:spacing w:after="80"/>
-      </w:pPr>
-      <w:r>
-        <w:t>2. Abrir e categorizar Registra um chamado por demanda, usando a categoria e o template correspondentes.</w:t>
-      </w:r>
-    </w:p>
-    <w:p>
-      <w:pPr>
-        <w:spacing w:after="80"/>
-      </w:pPr>
-      <w:r>
-        <w:t>3. Triar e direcionar Resolve no primeiro nível ou escala para a equipe responsável conforme a complexidade.</w:t>
-      </w:r>
-    </w:p>
-    <w:p>
-      <w:pPr>
-        <w:spacing w:after="80"/>
-      </w:pPr>
-      <w:r>
-        <w:t>4. Solucionar e encerrar Registra a solução, comunica o usuário e preserva o histórico para gestão e melhoria.</w:t>
-      </w:r>
-    </w:p>
-    <w:p>
-      <w:pPr>
-        <w:pStyle w:val="Heading1"/>
-      </w:pPr>
-      <w:r>
-        <w:t>05 Notificações Automáticas por E-mail</w:t>
-      </w:r>
-    </w:p>
-    <w:p>
-      <w:pPr>
-        <w:pStyle w:val="Heading2"/>
-      </w:pPr>
-      <w:r>
-        <w:t>5.1 Notificação de Abertura do Chamado</w:t>
-      </w:r>
-    </w:p>
-    <w:p>
-      <w:r>
-        <w:t>Após o registro do chamado no GLPI, o usuário receberá automaticamente um e-mail de confirmação contendo:</w:t>
-      </w:r>
-    </w:p>
-    <w:p>
-      <w:pPr>
-        <w:pStyle w:val="ListBullet"/>
-        <w:spacing w:after="80"/>
-      </w:pPr>
-      <w:r>
-        <w:t>🎫 Número do ticket</w:t>
-      </w:r>
-    </w:p>
-    <w:p>
-      <w:pPr>
-        <w:pStyle w:val="ListBullet"/>
-        <w:spacing w:after="80"/>
-      </w:pPr>
-      <w:r>
-        <w:t>👤 Nome do usuário</w:t>
-      </w:r>
-    </w:p>
-    <w:p>
-      <w:pPr>
-        <w:pStyle w:val="ListBullet"/>
-        <w:spacing w:after="80"/>
-      </w:pPr>
-      <w:r>
-        <w:t>📅 Data e hora de abertura do chamado</w:t>
-      </w:r>
-    </w:p>
-    <w:p>
-      <w:r>
-        <w:t xml:space="preserve">O e-mail será enviado automaticamente através da integração entre </w:t>
-      </w:r>
-      <w:r>
-        <w:rPr>
-          <w:b/>
-        </w:rPr>
-        <w:t>GLPI</w:t>
-      </w:r>
-      <w:r>
-        <w:t xml:space="preserve"> e </w:t>
-      </w:r>
-      <w:r>
-        <w:rPr>
-          <w:b/>
-        </w:rPr>
-        <w:t>n8n</w:t>
-      </w:r>
-      <w:r>
-        <w:t xml:space="preserve">, com processamento periódico a cada </w:t>
-      </w:r>
-      <w:r>
-        <w:rPr>
-          <w:b/>
-        </w:rPr>
-        <w:t>5 minutos</w:t>
-      </w:r>
-      <w:r>
-        <w:t>.</w:t>
-      </w:r>
-    </w:p>
-    <w:p>
-      <w:pPr>
-        <w:spacing w:after="80"/>
-      </w:pPr>
-      <w:r>
-        <w:rPr>
-          <w:color w:val="163A63"/>
-        </w:rPr>
-        <w:t>📌 Importante: As informações enviadas ao usuário refletem exatamente os dados registrados no chamado. Portanto, os campos devem ser preenchidos corretamente, utilizando linguagem clara, objetiva e formal.</w:t>
-      </w:r>
-    </w:p>
-    <w:p>
-      <w:pPr>
-        <w:pStyle w:val="Heading2"/>
-      </w:pPr>
-      <w:r>
-        <w:t>5.2 Notificação de Encerramento do Chamado</w:t>
-      </w:r>
-    </w:p>
-    <w:p>
-      <w:r>
-        <w:t xml:space="preserve">Após o encerramento do chamado com status </w:t>
-      </w:r>
-      <w:r>
-        <w:rPr>
-          <w:b/>
-        </w:rPr>
-        <w:t>Fechado</w:t>
-      </w:r>
-      <w:r>
-        <w:t>, o usuário receberá automaticamente um e-mail contendo:</w:t>
-      </w:r>
-    </w:p>
-    <w:p>
-      <w:pPr>
-        <w:pStyle w:val="ListBullet"/>
-        <w:spacing w:after="80"/>
-      </w:pPr>
-      <w:r>
-        <w:t>🎫 Número do ticket</w:t>
-      </w:r>
-    </w:p>
-    <w:p>
-      <w:pPr>
-        <w:pStyle w:val="ListBullet"/>
-        <w:spacing w:after="80"/>
-      </w:pPr>
-      <w:r>
-        <w:t>👤 Nome do usuário</w:t>
-      </w:r>
-    </w:p>
-    <w:p>
-      <w:pPr>
-        <w:pStyle w:val="ListBullet"/>
-        <w:spacing w:after="80"/>
-      </w:pPr>
-      <w:r>
-        <w:t>📅 Data de abertura</w:t>
-      </w:r>
-    </w:p>
-    <w:p>
-      <w:pPr>
-        <w:pStyle w:val="ListBullet"/>
-        <w:spacing w:after="80"/>
-      </w:pPr>
-      <w:r>
-        <w:t>✅ Confirmação da finalização do chamado</w:t>
-      </w:r>
-    </w:p>
-    <w:p>
-      <w:pPr>
-        <w:pStyle w:val="ListBullet"/>
-        <w:spacing w:after="80"/>
-      </w:pPr>
-      <w:r>
-        <w:t>⭐ Link da pesquisa de satisfação</w:t>
-      </w:r>
-    </w:p>
-    <w:p>
-      <w:r>
-        <w:t xml:space="preserve">A pesquisa de satisfação tem como objetivo fortalecer a </w:t>
-      </w:r>
-      <w:r>
-        <w:rPr>
-          <w:b/>
-        </w:rPr>
-        <w:t>melhoria contínua</w:t>
-      </w:r>
-      <w:r>
-        <w:t xml:space="preserve"> dos atendimentos prestados pela GTIC.</w:t>
-      </w:r>
-    </w:p>
-    <w:p>
-      <w:pPr>
-        <w:spacing w:after="80"/>
-      </w:pPr>
-      <w:r>
-        <w:rPr>
-          <w:color w:val="163A63"/>
-        </w:rPr>
-        <w:t>⚠️ Atenção: Chamados apenas com status "Solucionado" não disparam a notificação automática de encerramento.</w:t>
-      </w:r>
-    </w:p>
-    <w:p>
-      <w:pPr>
-        <w:pStyle w:val="Heading2"/>
-      </w:pPr>
-      <w:r>
-        <w:t>5.3 Regras Obrigatórias para Funcionamento das Notificações</w:t>
-      </w:r>
-    </w:p>
-    <w:p>
-      <w:pPr>
-        <w:pStyle w:val="ListBullet"/>
-        <w:spacing w:after="80"/>
-      </w:pPr>
-      <w:r>
-        <w:t>📧 O campo E-mail deverá obrigatoriamente ser preenchido no momento da abertura do chamado</w:t>
-      </w:r>
-    </w:p>
-    <w:p>
-      <w:pPr>
-        <w:pStyle w:val="ListBullet"/>
-        <w:spacing w:after="80"/>
-      </w:pPr>
-      <w:r>
-        <w:t>🔗 Os scripts de Sistemas e Infraestrutura encontram-se padronizados e integrados ao n8n</w:t>
-      </w:r>
-    </w:p>
-    <w:p>
-      <w:pPr>
-        <w:pStyle w:val="ListBullet"/>
-        <w:spacing w:after="80"/>
-      </w:pPr>
-      <w:r>
-        <w:t>🚫 Os campos padronizados não deverão ser alterados sem validação prévia da administração do GLPI</w:t>
-      </w:r>
-    </w:p>
-    <w:p>
-      <w:pPr>
-        <w:pStyle w:val="ListBullet"/>
-        <w:spacing w:after="80"/>
-      </w:pPr>
-      <w:r>
-        <w:t>⚠️ Alterações indevidas poderão comprometer o funcionamento das notificações automáticas e integrações sistêmicas</w:t>
-      </w:r>
-    </w:p>
-    <w:p>
-      <w:pPr>
-        <w:pStyle w:val="Heading1"/>
-      </w:pPr>
-      <w:r>
-        <w:t>06 Orientações e Passo a Passo para Atendimento</w:t>
-      </w:r>
-    </w:p>
-    <w:p>
-      <w:pPr>
-        <w:pStyle w:val="Heading2"/>
-      </w:pPr>
-      <w:r>
-        <w:t>6.1 Linguagem e Escrita</w:t>
-      </w:r>
-    </w:p>
-    <w:p>
-      <w:r>
-        <w:t>Ao abrir um chamado, o usuário deve:</w:t>
-      </w:r>
-    </w:p>
-    <w:p>
-      <w:pPr>
-        <w:pStyle w:val="ListBullet"/>
-        <w:spacing w:after="80"/>
-      </w:pPr>
-      <w:r>
-        <w:t>✅ Utilizar linguagem formal</w:t>
-      </w:r>
-    </w:p>
-    <w:p>
-      <w:pPr>
-        <w:pStyle w:val="ListBullet"/>
-        <w:spacing w:after="80"/>
-      </w:pPr>
-      <w:r>
-        <w:t>✅ Redigir frases claras e objetivas</w:t>
-      </w:r>
-    </w:p>
-    <w:p>
-      <w:pPr>
-        <w:pStyle w:val="ListBullet"/>
-        <w:spacing w:after="80"/>
-      </w:pPr>
-      <w:r>
-        <w:t>✅ Atentar para a concordância verbal e nominal</w:t>
-      </w:r>
-    </w:p>
-    <w:p>
-      <w:pPr>
-        <w:pStyle w:val="ListBullet"/>
-        <w:spacing w:after="80"/>
-      </w:pPr>
-      <w:r>
-        <w:t>❌ Evitar abreviações informais</w:t>
-      </w:r>
-    </w:p>
-    <w:p>
-      <w:pPr>
-        <w:pStyle w:val="ListBullet"/>
-        <w:spacing w:after="80"/>
-      </w:pPr>
-      <w:r>
-        <w:t>❌ Evitar termos genéricos como "não funciona" sem detalhamento</w:t>
-      </w:r>
-    </w:p>
-    <w:p>
-      <w:pPr>
-        <w:pStyle w:val="ListBullet"/>
-        <w:spacing w:after="80"/>
-      </w:pPr>
-      <w:r>
-        <w:t>❌ Não inserir letras maiúsculas desnecessárias</w:t>
-      </w:r>
-    </w:p>
-    <w:p>
-      <w:pPr>
-        <w:pStyle w:val="Heading2"/>
-      </w:pPr>
-      <w:r>
-        <w:t>6.2 Exemplos de Descrições</w:t>
-      </w:r>
-    </w:p>
-    <w:p>
-      <w:pPr>
-        <w:pStyle w:val="ListBullet"/>
-        <w:spacing w:after="60"/>
-        <w:ind w:left="461" w:hanging="259"/>
-      </w:pPr>
-      <w:r>
-        <w:t>"O sistema não funciona."</w:t>
-      </w:r>
-    </w:p>
-    <w:p>
-      <w:pPr>
-        <w:pStyle w:val="ListBullet"/>
-        <w:spacing w:after="60"/>
-        <w:ind w:left="461" w:hanging="259"/>
-      </w:pPr>
-      <w:r>
-        <w:t>"Tá dando erro."</w:t>
-      </w:r>
-    </w:p>
-    <w:p>
-      <w:pPr>
-        <w:pStyle w:val="ListBullet"/>
-        <w:spacing w:after="60"/>
-        <w:ind w:left="461" w:hanging="259"/>
-      </w:pPr>
-      <w:r>
-        <w:t>"Não consigo entrar."</w:t>
-      </w:r>
-    </w:p>
-    <w:p>
-      <w:pPr>
-        <w:pStyle w:val="ListBullet"/>
-        <w:spacing w:after="60"/>
-        <w:ind w:left="461" w:hanging="259"/>
-      </w:pPr>
-      <w:r>
-        <w:t>"Problema no computador."</w:t>
-      </w:r>
-    </w:p>
-    <w:p>
-      <w:pPr>
-        <w:pStyle w:val="ListBullet"/>
-        <w:spacing w:after="60"/>
-        <w:ind w:left="461" w:hanging="259"/>
-      </w:pPr>
-      <w:r>
-        <w:t>"Aplicação fora do ar."</w:t>
-      </w:r>
-    </w:p>
-    <w:p>
-      <w:pPr>
-        <w:spacing w:after="80"/>
-      </w:pPr>
-      <w:r>
-        <w:rPr>
-          <w:color w:val="163A63"/>
-        </w:rPr>
-        <w:t>📌 Por que não usar: Essas descrições são genéricas, não informam o sistema afetado, o tipo de erro, nem o contexto do problema, dificultando a análise e a resolução do chamado.</w:t>
-      </w:r>
-    </w:p>
-    <w:p>
-      <w:pPr>
-        <w:pStyle w:val="ListBullet"/>
-        <w:spacing w:after="60"/>
-        <w:ind w:left="461" w:hanging="259"/>
-      </w:pPr>
-      <w:r>
-        <w:t xml:space="preserve">"Ao tentar acessar o sistema </w:t>
-      </w:r>
-      <w:r>
-        <w:rPr>
-          <w:b/>
-        </w:rPr>
-        <w:t>X</w:t>
-      </w:r>
-      <w:r>
-        <w:t xml:space="preserve">, o usuário recebe a mensagem de erro </w:t>
-      </w:r>
-      <w:r>
-        <w:rPr>
-          <w:i/>
-        </w:rPr>
-        <w:t>'acesso não autorizado'</w:t>
-      </w:r>
-      <w:r>
-        <w:t xml:space="preserve"> desde às 9h do dia 12/02."</w:t>
-      </w:r>
-    </w:p>
-    <w:p>
-      <w:pPr>
-        <w:pStyle w:val="ListBullet"/>
-        <w:spacing w:after="60"/>
-        <w:ind w:left="461" w:hanging="259"/>
-      </w:pPr>
-      <w:r>
-        <w:t xml:space="preserve">"O sistema </w:t>
-      </w:r>
-      <w:r>
-        <w:rPr>
-          <w:b/>
-        </w:rPr>
-        <w:t>Y</w:t>
-      </w:r>
-      <w:r>
-        <w:t xml:space="preserve"> apresenta lentidão ao realizar o cadastro de usuários, principalmente no período da manhã."</w:t>
-      </w:r>
-    </w:p>
-    <w:p>
-      <w:pPr>
-        <w:pStyle w:val="ListBullet"/>
-        <w:spacing w:after="60"/>
-        <w:ind w:left="461" w:hanging="259"/>
-      </w:pPr>
-      <w:r>
-        <w:t xml:space="preserve">"Após atualização realizada em 11/02, o módulo </w:t>
-      </w:r>
-      <w:r>
-        <w:rPr>
-          <w:b/>
-        </w:rPr>
-        <w:t>Z</w:t>
-      </w:r>
-      <w:r>
-        <w:t xml:space="preserve"> não permite a finalização de atendimentos."</w:t>
-      </w:r>
-    </w:p>
-    <w:p>
-      <w:pPr>
-        <w:pStyle w:val="ListBullet"/>
-        <w:spacing w:after="60"/>
-        <w:ind w:left="461" w:hanging="259"/>
-      </w:pPr>
-      <w:r>
-        <w:t xml:space="preserve">"O computador da sala </w:t>
-      </w:r>
-      <w:r>
-        <w:rPr>
-          <w:b/>
-        </w:rPr>
-        <w:t>A</w:t>
-      </w:r>
-      <w:r>
-        <w:t xml:space="preserve"> não conecta à rede interna desde o início do expediente."</w:t>
-      </w:r>
-    </w:p>
-    <w:p>
-      <w:pPr>
-        <w:spacing w:after="80"/>
-      </w:pPr>
-      <w:r>
-        <w:rPr>
-          <w:color w:val="163A63"/>
-        </w:rPr>
-        <w:t>📌 Por que usar: Essas descrições são claras, objetivas, indicam o sistema afetado, o comportamento observado e o momento da ocorrência, permitindo um atendimento mais rápido e eficiente.</w:t>
-      </w:r>
-    </w:p>
-    <w:p>
-      <w:pPr>
-        <w:pStyle w:val="Heading2"/>
-      </w:pPr>
-      <w:r>
-        <w:t>6.3 Descrição do Chamado – Boas Práticas</w:t>
-      </w:r>
-    </w:p>
-    <w:p>
-      <w:r>
-        <w:t>A descrição deve conter, sempre que possível:</w:t>
-      </w:r>
-    </w:p>
-    <w:p>
-      <w:pPr>
-        <w:pStyle w:val="ListBullet"/>
-        <w:spacing w:after="80"/>
-      </w:pPr>
-      <w:r>
-        <w:t>🖥️ Sistema ou serviço afetado</w:t>
-      </w:r>
-    </w:p>
-    <w:p>
-      <w:pPr>
-        <w:pStyle w:val="ListBullet"/>
-        <w:spacing w:after="80"/>
-      </w:pPr>
-      <w:r>
-        <w:t>📝 Descrição clara do problema ou solicitação</w:t>
-      </w:r>
-    </w:p>
-    <w:p>
-      <w:pPr>
-        <w:pStyle w:val="ListBullet"/>
-        <w:spacing w:after="80"/>
-      </w:pPr>
-      <w:r>
-        <w:t>📅 Quando o problema ocorreu</w:t>
-      </w:r>
-    </w:p>
-    <w:p>
-      <w:pPr>
-        <w:pStyle w:val="ListBullet"/>
-        <w:spacing w:after="80"/>
-      </w:pPr>
-      <w:r>
-        <w:t>🔁 Se o erro é recorrente ou pontual</w:t>
-      </w:r>
-    </w:p>
-    <w:p>
-      <w:pPr>
-        <w:pStyle w:val="ListBullet"/>
-        <w:spacing w:after="80"/>
-      </w:pPr>
-      <w:r>
-        <w:t>📸 Prints de tela ou evidências (quando aplicável)</w:t>
-      </w:r>
-    </w:p>
-    <w:p>
-      <w:pPr>
-        <w:pStyle w:val="Heading2"/>
-      </w:pPr>
-      <w:r>
-        <w:t>6.4 Passo a Passo por Tipo de Solicitação</w:t>
-      </w:r>
-    </w:p>
-    <w:p>
-      <w:r>
-        <w:t>Para cada chamado, a equipe deve identificar o tipo de solicitação e seguir um fluxo básico de tratamento. O objetivo é evitar registros incompletos, retrabalho e encaminhamentos desnecessários.</w:t>
-      </w:r>
-    </w:p>
-    <w:p>
-      <w:pPr>
-        <w:pStyle w:val="Heading3"/>
-      </w:pPr>
-      <w:r>
-        <w:t>Cadastro, liberação ou alteração de acesso</w:t>
-      </w:r>
-    </w:p>
-    <w:p>
-      <w:pPr>
-        <w:pStyle w:val="ListBullet"/>
-        <w:spacing w:after="60"/>
-        <w:ind w:left="461" w:hanging="259"/>
-      </w:pPr>
-      <w:r>
-        <w:t>Conferir nome completo, CPF ou matrícula, unidade, função e sistema solicitado.</w:t>
-      </w:r>
-    </w:p>
-    <w:p>
-      <w:pPr>
-        <w:pStyle w:val="ListBullet"/>
-        <w:spacing w:after="60"/>
-        <w:ind w:left="461" w:hanging="259"/>
-      </w:pPr>
-      <w:r>
-        <w:t>Validar se há autorização da chefia ou responsável pela unidade, quando aplicável.</w:t>
-      </w:r>
-    </w:p>
-    <w:p>
-      <w:pPr>
-        <w:pStyle w:val="ListBullet"/>
-        <w:spacing w:after="60"/>
-        <w:ind w:left="461" w:hanging="259"/>
-      </w:pPr>
-      <w:r>
-        <w:t>Executar o cadastro ou alteração quando o serviço estiver previsto para a Central de Serviços.</w:t>
-      </w:r>
-    </w:p>
-    <w:p>
-      <w:pPr>
-        <w:pStyle w:val="ListBullet"/>
-        <w:spacing w:after="60"/>
-        <w:ind w:left="461" w:hanging="259"/>
-      </w:pPr>
-      <w:r>
-        <w:t>Registrar no chamado quais usuários foram atendidos e qual acesso foi concedido.</w:t>
-      </w:r>
-    </w:p>
-    <w:p>
-      <w:pPr>
-        <w:pStyle w:val="Heading3"/>
-      </w:pPr>
-      <w:r>
-        <w:t>Erro de sistema</w:t>
-      </w:r>
-    </w:p>
-    <w:p>
-      <w:pPr>
-        <w:pStyle w:val="ListBullet"/>
-        <w:spacing w:after="60"/>
-        <w:ind w:left="461" w:hanging="259"/>
-      </w:pPr>
-      <w:r>
-        <w:t>Identificar sistema, módulo, tela, mensagem de erro e horário da ocorrência.</w:t>
-      </w:r>
-    </w:p>
-    <w:p>
-      <w:pPr>
-        <w:pStyle w:val="ListBullet"/>
-        <w:spacing w:after="60"/>
-        <w:ind w:left="461" w:hanging="259"/>
-      </w:pPr>
-      <w:r>
-        <w:t>Solicitar evidência, como print ou descrição do passo que gerou o erro.</w:t>
-      </w:r>
-    </w:p>
-    <w:p>
-      <w:pPr>
-        <w:pStyle w:val="ListBullet"/>
-        <w:spacing w:after="60"/>
-        <w:ind w:left="461" w:hanging="259"/>
-      </w:pPr>
-      <w:r>
-        <w:t>Verificar se é caso isolado ou se afeta outros usuários/unidades.</w:t>
-      </w:r>
-    </w:p>
-    <w:p>
-      <w:pPr>
-        <w:pStyle w:val="ListBullet"/>
-        <w:spacing w:after="60"/>
-        <w:ind w:left="461" w:hanging="259"/>
-      </w:pPr>
-      <w:r>
-        <w:t>Escalonar para N2/N3 quando exigir análise técnica, correção ou intervenção sistêmica.</w:t>
-      </w:r>
-    </w:p>
-    <w:p>
-      <w:pPr>
-        <w:pStyle w:val="Heading3"/>
-      </w:pPr>
-      <w:r>
-        <w:t>Equipamento, rede ou infraestrutura</w:t>
-      </w:r>
-    </w:p>
-    <w:p>
-      <w:pPr>
-        <w:pStyle w:val="ListBullet"/>
-        <w:spacing w:after="60"/>
-        <w:ind w:left="461" w:hanging="259"/>
-      </w:pPr>
-      <w:r>
-        <w:t>Identificar patrimônio, setor, unidade, ponto de rede e telefone de contato.</w:t>
-      </w:r>
-    </w:p>
-    <w:p>
-      <w:pPr>
-        <w:pStyle w:val="ListBullet"/>
-        <w:spacing w:after="60"/>
-        <w:ind w:left="461" w:hanging="259"/>
-      </w:pPr>
-      <w:r>
-        <w:t>Registrar sintomas objetivos: sem rede, sem impressão, lentidão, tela apagada, travamento.</w:t>
-      </w:r>
-    </w:p>
-    <w:p>
-      <w:pPr>
-        <w:pStyle w:val="ListBullet"/>
-        <w:spacing w:after="60"/>
-        <w:ind w:left="461" w:hanging="259"/>
-      </w:pPr>
-      <w:r>
-        <w:t>Orientar testes simples quando possível, como reiniciar equipamento ou verificar cabos.</w:t>
-      </w:r>
-    </w:p>
-    <w:p>
-      <w:pPr>
-        <w:pStyle w:val="ListBullet"/>
-        <w:spacing w:after="60"/>
-        <w:ind w:left="461" w:hanging="259"/>
-      </w:pPr>
-      <w:r>
-        <w:t>Encaminhar para a equipe responsável quando houver necessidade de visita ou manutenção.</w:t>
-      </w:r>
-    </w:p>
-    <w:p>
-      <w:pPr>
-        <w:pStyle w:val="Heading3"/>
-      </w:pPr>
-      <w:r>
-        <w:t>Dúvida, orientação ou solicitação administrativa</w:t>
-      </w:r>
-    </w:p>
-    <w:p>
-      <w:pPr>
-        <w:pStyle w:val="ListBullet"/>
-        <w:spacing w:after="60"/>
-        <w:ind w:left="461" w:hanging="259"/>
-      </w:pPr>
-      <w:r>
-        <w:t>Confirmar qual procedimento o usuário precisa executar.</w:t>
-      </w:r>
-    </w:p>
-    <w:p>
-      <w:pPr>
-        <w:pStyle w:val="ListBullet"/>
-        <w:spacing w:after="60"/>
-        <w:ind w:left="461" w:hanging="259"/>
-      </w:pPr>
-      <w:r>
-        <w:t>Orientar com base em POP, manual ou script oficial, sempre que houver documento publicado.</w:t>
-      </w:r>
-    </w:p>
-    <w:p>
-      <w:pPr>
-        <w:pStyle w:val="ListBullet"/>
-        <w:spacing w:after="60"/>
-        <w:ind w:left="461" w:hanging="259"/>
-      </w:pPr>
-      <w:r>
-        <w:t>Registrar a orientação prestada no histórico do chamado.</w:t>
-      </w:r>
-    </w:p>
-    <w:p>
-      <w:pPr>
-        <w:pStyle w:val="ListBullet"/>
-        <w:spacing w:after="60"/>
-        <w:ind w:left="461" w:hanging="259"/>
-      </w:pPr>
-      <w:r>
-        <w:t>Encerrar somente após deixar claro o encaminhamento ou a resposta fornecida.</w:t>
-      </w:r>
-    </w:p>
-    <w:p>
-      <w:pPr>
-        <w:pStyle w:val="Heading2"/>
-      </w:pPr>
-      <w:r>
-        <w:t>6.5 O que é Demanda Simples e Padronizada para a Central de Serviços?</w:t>
-      </w:r>
-    </w:p>
-    <w:p>
-      <w:r>
-        <w:t xml:space="preserve">Considera-se </w:t>
-      </w:r>
-      <w:r>
-        <w:rPr>
-          <w:b/>
-        </w:rPr>
-        <w:t>demanda simples e padronizada</w:t>
-      </w:r>
-      <w:r>
-        <w:t xml:space="preserve"> aquela que possui procedimento conhecido, baixo risco operacional, informações suficientes no chamado e não exige análise técnica aprofundada, alteração estrutural, desenvolvimento, correção de sistema ou decisão de gestão.</w:t>
-      </w:r>
-    </w:p>
-    <w:p>
-      <w:pPr>
-        <w:pStyle w:val="Heading3"/>
-      </w:pPr>
-      <w:r>
-        <w:t>Exemplos que a Central de Serviços pode atender</w:t>
-      </w:r>
-    </w:p>
-    <w:p>
-      <w:pPr>
-        <w:pStyle w:val="ListBullet"/>
-        <w:spacing w:after="60"/>
-        <w:ind w:left="461" w:hanging="259"/>
-      </w:pPr>
-      <w:r>
-        <w:t>Cadastro de usuário em sistema com dados completos e autorização informada.</w:t>
-      </w:r>
-    </w:p>
-    <w:p>
-      <w:pPr>
-        <w:pStyle w:val="ListBullet"/>
-        <w:spacing w:after="60"/>
-        <w:ind w:left="461" w:hanging="259"/>
-      </w:pPr>
-      <w:r>
-        <w:t>Reset de senha ou desbloqueio de acesso, conforme regra do serviço.</w:t>
-      </w:r>
-    </w:p>
-    <w:p>
-      <w:pPr>
-        <w:pStyle w:val="ListBullet"/>
-        <w:spacing w:after="60"/>
-        <w:ind w:left="461" w:hanging="259"/>
-      </w:pPr>
-      <w:r>
-        <w:t>Atualização simples de dados cadastrais, quando prevista no catálogo.</w:t>
-      </w:r>
-    </w:p>
-    <w:p>
-      <w:pPr>
-        <w:pStyle w:val="ListBullet"/>
-        <w:spacing w:after="60"/>
-        <w:ind w:left="461" w:hanging="259"/>
-      </w:pPr>
-      <w:r>
-        <w:t>Orientação de uso baseada em manual, POP ou script já validado.</w:t>
-      </w:r>
-    </w:p>
-    <w:p>
-      <w:pPr>
-        <w:pStyle w:val="ListBullet"/>
-        <w:spacing w:after="60"/>
-        <w:ind w:left="461" w:hanging="259"/>
-      </w:pPr>
-      <w:r>
-        <w:t>Triagem e correção de informação incompleta antes do encaminhamento.</w:t>
-      </w:r>
-    </w:p>
-    <w:p>
-      <w:pPr>
-        <w:pStyle w:val="Heading3"/>
-      </w:pPr>
-      <w:r>
-        <w:t>Quando não é da Central de Serviços</w:t>
-      </w:r>
-    </w:p>
-    <w:p>
-      <w:pPr>
-        <w:pStyle w:val="ListBullet"/>
-        <w:spacing w:after="60"/>
-        <w:ind w:left="461" w:hanging="259"/>
-      </w:pPr>
-      <w:r>
-        <w:t>Erro sem causa conhecida ou que exige análise em banco, servidor ou código.</w:t>
-      </w:r>
-    </w:p>
-    <w:p>
-      <w:pPr>
-        <w:pStyle w:val="ListBullet"/>
-        <w:spacing w:after="60"/>
-        <w:ind w:left="461" w:hanging="259"/>
-      </w:pPr>
-      <w:r>
-        <w:t>Solicitação sem autorização obrigatória ou com conflito de regra de negócio.</w:t>
-      </w:r>
-    </w:p>
-    <w:p>
-      <w:pPr>
-        <w:pStyle w:val="ListBullet"/>
-        <w:spacing w:after="60"/>
-        <w:ind w:left="461" w:hanging="259"/>
-      </w:pPr>
-      <w:r>
-        <w:t>Incidente que afeta vários usuários, unidade inteira ou serviço crítico.</w:t>
-      </w:r>
-    </w:p>
-    <w:p>
-      <w:pPr>
-        <w:pStyle w:val="ListBullet"/>
-        <w:spacing w:after="60"/>
-        <w:ind w:left="461" w:hanging="259"/>
-      </w:pPr>
-      <w:r>
-        <w:t>Criação de nova funcionalidade, relatório, integração ou mudança de fluxo.</w:t>
-      </w:r>
-    </w:p>
-    <w:p>
-      <w:pPr>
-        <w:pStyle w:val="ListBullet"/>
-        <w:spacing w:after="60"/>
-        <w:ind w:left="461" w:hanging="259"/>
-      </w:pPr>
-      <w:r>
-        <w:t>Manutenção física, visita técnica ou intervenção especializada.</w:t>
-      </w:r>
-    </w:p>
-    <w:p>
-      <w:pPr>
-        <w:spacing w:after="80"/>
-      </w:pPr>
-      <w:r>
-        <w:rPr>
-          <w:color w:val="163A63"/>
-        </w:rPr>
-        <w:t>Critério prático: se o atendente consegue resolver seguindo um procedimento já documentado, com dados completos e sem precisar investigar causa técnica, a demanda tende a ser da Central de Serviços. Se precisar analisar, decidir, corrigir estrutura ou envolver especialista, deve ser escalonada.</w:t>
-      </w:r>
-    </w:p>
-    <w:p>
-      <w:pPr>
-        <w:pStyle w:val="Heading2"/>
-      </w:pPr>
-      <w:r>
-        <w:t>6.6 Um Chamado ou Vários Chamados?</w:t>
-      </w:r>
-    </w:p>
-    <w:p>
-      <w:pPr>
-        <w:pStyle w:val="Heading3"/>
-      </w:pPr>
-      <w:r>
-        <w:t>Um chamado</w:t>
-      </w:r>
-    </w:p>
-    <w:p>
-      <w:pPr>
-        <w:pStyle w:val="ListBullet"/>
-        <w:spacing w:after="60"/>
-        <w:ind w:left="461" w:hanging="259"/>
-      </w:pPr>
-      <w:r>
-        <w:t>Uma chefia solicita cadastro de 12 profissionais no mesmo sistema, para a mesma unidade e com o mesmo perfil de acesso.</w:t>
-      </w:r>
-    </w:p>
-    <w:p>
-      <w:pPr>
-        <w:pStyle w:val="ListBullet"/>
-        <w:spacing w:after="60"/>
-        <w:ind w:left="461" w:hanging="259"/>
-      </w:pPr>
-      <w:r>
-        <w:t>Um setor solicita reset de senha para 5 usuários do mesmo sistema, todos listados no chamado.</w:t>
-      </w:r>
-    </w:p>
-    <w:p>
-      <w:pPr>
-        <w:pStyle w:val="ListBullet"/>
-        <w:spacing w:after="60"/>
-        <w:ind w:left="461" w:hanging="259"/>
-      </w:pPr>
-      <w:r>
-        <w:t>Uma unidade pede liberação do mesmo módulo para uma equipe específica, com autorização única da chefia.</w:t>
-      </w:r>
-    </w:p>
-    <w:p>
-      <w:pPr>
-        <w:pStyle w:val="Heading3"/>
-      </w:pPr>
-      <w:r>
-        <w:t>Chamados separados</w:t>
-      </w:r>
-    </w:p>
-    <w:p>
-      <w:pPr>
-        <w:pStyle w:val="ListBullet"/>
-        <w:spacing w:after="60"/>
-        <w:ind w:left="461" w:hanging="259"/>
-      </w:pPr>
-      <w:r>
-        <w:t>O solicitante pede cadastro de profissionais em sistemas diferentes, como SEI, CNES e PEC.</w:t>
-      </w:r>
-    </w:p>
-    <w:p>
-      <w:pPr>
-        <w:pStyle w:val="ListBullet"/>
-        <w:spacing w:after="60"/>
-        <w:ind w:left="461" w:hanging="259"/>
-      </w:pPr>
-      <w:r>
-        <w:t>A lista mistura unidades diferentes, perfis de acesso diferentes ou autorizações distintas.</w:t>
-      </w:r>
-    </w:p>
-    <w:p>
-      <w:pPr>
-        <w:pStyle w:val="ListBullet"/>
-        <w:spacing w:after="60"/>
-        <w:ind w:left="461" w:hanging="259"/>
-      </w:pPr>
-      <w:r>
-        <w:t>Parte da demanda é cadastro, outra parte é correção de erro, desbloqueio ou alteração de perfil.</w:t>
-      </w:r>
-    </w:p>
-    <w:p>
-      <w:pPr>
-        <w:pStyle w:val="ListBullet"/>
-        <w:spacing w:after="60"/>
-        <w:ind w:left="461" w:hanging="259"/>
-      </w:pPr>
-      <w:r>
-        <w:t>Cada profissional apresenta um problema específico que exige análise individual.</w:t>
-      </w:r>
-    </w:p>
-    <w:p>
-      <w:pPr>
-        <w:pStyle w:val="Heading1"/>
-      </w:pPr>
-      <w:r>
-        <w:t>07 Categorização do Chamado e Templates</w:t>
-      </w:r>
-    </w:p>
-    <w:p>
-      <w:r>
-        <w:t xml:space="preserve">O GLPI foi configurado com </w:t>
-      </w:r>
-      <w:r>
-        <w:rPr>
-          <w:b/>
-        </w:rPr>
-        <w:t>templates específicos para cada serviço</w:t>
-      </w:r>
-      <w:r>
-        <w:t xml:space="preserve">, que são carregados automaticamente no momento em que o usuário realiza a </w:t>
-      </w:r>
-      <w:r>
-        <w:rPr>
-          <w:b/>
-        </w:rPr>
-        <w:t>categorização do chamado</w:t>
-      </w:r>
-      <w:r>
-        <w:t>. Cada tipo de serviço possui um template próprio, adequado às suas particularidades e necessidades de atendimento.</w:t>
-      </w:r>
-    </w:p>
-    <w:p>
-      <w:r>
-        <w:t xml:space="preserve">Embora os templates sejam diferentes conforme o serviço selecionado, </w:t>
-      </w:r>
-      <w:r>
-        <w:rPr>
-          <w:b/>
-        </w:rPr>
-        <w:t>todos possuem campos obrigatórios em comum</w:t>
-      </w:r>
-      <w:r>
-        <w:t>:</w:t>
-      </w:r>
-    </w:p>
-    <w:p>
-      <w:pPr>
-        <w:pStyle w:val="ListBullet"/>
-        <w:spacing w:after="80"/>
-      </w:pPr>
-      <w:r>
-        <w:t>👤 Nome — identificação do solicitante</w:t>
-      </w:r>
-    </w:p>
-    <w:p>
-      <w:pPr>
-        <w:pStyle w:val="ListBullet"/>
-        <w:spacing w:after="80"/>
-      </w:pPr>
-      <w:r>
-        <w:t>📞 Telefone — contato para comunicação durante o atendimento</w:t>
-      </w:r>
-    </w:p>
-    <w:p>
-      <w:pPr>
-        <w:pStyle w:val="ListBullet"/>
-        <w:spacing w:after="80"/>
-      </w:pPr>
-      <w:r>
-        <w:t>📧 E-mail — essencial para o envio das notificações automáticas</w:t>
-      </w:r>
-    </w:p>
-    <w:p>
-      <w:pPr>
-        <w:pStyle w:val="ListBullet"/>
-        <w:spacing w:after="60"/>
-        <w:ind w:left="461" w:hanging="259"/>
-      </w:pPr>
-      <w:r>
-        <w:t xml:space="preserve">Ao selecionar o serviço </w:t>
-      </w:r>
-      <w:r>
-        <w:rPr>
-          <w:b/>
-        </w:rPr>
-        <w:t>"SEI"</w:t>
-      </w:r>
-      <w:r>
-        <w:t xml:space="preserve">, o GLPI carrega um template específico com campos técnicos adicionais. Apesar das diferenças, os campos </w:t>
-      </w:r>
-      <w:r>
-        <w:rPr>
-          <w:b/>
-        </w:rPr>
-        <w:t>Nome, Telefone e E-mail</w:t>
-      </w:r>
-      <w:r>
-        <w:t xml:space="preserve"> estarão sempre presentes e são de preenchimento obrigatório.</w:t>
-      </w:r>
-    </w:p>
-    <w:p>
-      <w:pPr>
-        <w:spacing w:after="80"/>
-      </w:pPr>
-      <w:r>
-        <w:rPr>
-          <w:color w:val="163A63"/>
-        </w:rPr>
-        <w:t>📌 Atenção: O correto preenchimento desses campos é essencial para garantir a identificação do solicitante, a comunicação durante o atendimento e o adequado encaminhamento do chamado.</w:t>
-      </w:r>
-    </w:p>
-    <w:p>
-      <w:pPr>
-        <w:pStyle w:val="Heading1"/>
-      </w:pPr>
-      <w:r>
-        <w:t>08 Papéis, Níveis e Escalonamento</w:t>
-      </w:r>
-    </w:p>
-    <w:p>
-      <w:r>
-        <w:t xml:space="preserve">Os papéis e responsabilidades das equipes estão alinhados ao </w:t>
-      </w:r>
-      <w:r>
-        <w:rPr>
-          <w:b/>
-        </w:rPr>
-        <w:t>Catálogo de Serviços</w:t>
-      </w:r>
-      <w:r>
-        <w:t xml:space="preserve"> e às boas práticas de </w:t>
-      </w:r>
-      <w:r>
-        <w:rPr>
-          <w:b/>
-        </w:rPr>
-        <w:t>governança ITIL</w:t>
-      </w:r>
-      <w:r>
-        <w:t>, garantindo clareza na atuação de cada nível de atendimento e adequada gestão das demandas.</w:t>
-      </w:r>
-    </w:p>
-    <w:p>
-      <w:pPr>
-        <w:pStyle w:val="ListBullet"/>
-        <w:spacing w:after="60"/>
-        <w:ind w:left="461" w:hanging="259"/>
-      </w:pPr>
-      <w:r>
-        <w:t>Realizar o atendimento inicial ao usuário, conferindo dados obrigatórios e contexto da solicitação</w:t>
-      </w:r>
-    </w:p>
-    <w:p>
-      <w:pPr>
-        <w:pStyle w:val="ListBullet"/>
-        <w:spacing w:after="60"/>
-        <w:ind w:left="461" w:hanging="259"/>
-      </w:pPr>
-      <w:r>
-        <w:t>Registrar corretamente as informações no GLPI, incluindo sistema, unidade, contato, evidências e autorização quando aplicável</w:t>
-      </w:r>
-    </w:p>
-    <w:p>
-      <w:pPr>
-        <w:pStyle w:val="ListBullet"/>
-        <w:spacing w:after="60"/>
-        <w:ind w:left="461" w:hanging="259"/>
-      </w:pPr>
-      <w:r>
-        <w:t>Resolver e encerrar demandas simples e padronizadas, conforme catálogo, POP, manual ou script oficial</w:t>
-      </w:r>
-    </w:p>
-    <w:p>
-      <w:pPr>
-        <w:pStyle w:val="ListBullet"/>
-        <w:spacing w:after="60"/>
-        <w:ind w:left="461" w:hanging="259"/>
-      </w:pPr>
-      <w:r>
-        <w:t>Orientar o usuário quando houver procedimento documentado e registrar a orientação no histórico</w:t>
-      </w:r>
-    </w:p>
-    <w:p>
-      <w:pPr>
-        <w:pStyle w:val="ListBullet"/>
-        <w:spacing w:after="60"/>
-        <w:ind w:left="461" w:hanging="259"/>
-      </w:pPr>
-      <w:r>
-        <w:t>Escalonar o chamado quando ultrapassar seu escopo de atuação, descrevendo o motivo do encaminhamento e as verificações já realizadas</w:t>
-      </w:r>
-    </w:p>
-    <w:p>
-      <w:pPr>
-        <w:spacing w:after="80"/>
-      </w:pPr>
-      <w:r>
-        <w:rPr>
-          <w:color w:val="163A63"/>
-        </w:rPr>
-        <w:t>Resumo da Central de Serviços: atende o que é repetível, documentado e de baixo risco. Não deve assumir demandas que dependam de investigação técnica, alteração estrutural, regra de negócio não validada ou autorização ausente.</w:t>
-      </w:r>
-    </w:p>
-    <w:p>
-      <w:pPr>
-        <w:pStyle w:val="ListBullet"/>
-        <w:spacing w:after="60"/>
-        <w:ind w:left="461" w:hanging="259"/>
-      </w:pPr>
-      <w:r>
-        <w:t>Atender demandas técnicas de sistemas escalonadas pela Central de Serviços que exigem atendimento presencial na unidade</w:t>
-      </w:r>
-    </w:p>
-    <w:p>
-      <w:pPr>
-        <w:pStyle w:val="ListBullet"/>
-        <w:spacing w:after="60"/>
-        <w:ind w:left="461" w:hanging="259"/>
-      </w:pPr>
-      <w:r>
-        <w:t>Realizar implantação, configuração e ajustes de sistemas em campo</w:t>
-      </w:r>
-    </w:p>
-    <w:p>
-      <w:pPr>
-        <w:pStyle w:val="ListBullet"/>
-        <w:spacing w:after="60"/>
-        <w:ind w:left="461" w:hanging="259"/>
-      </w:pPr>
-      <w:r>
-        <w:t>Realizar análises mais aprofundadas de erros e falhas de sistema</w:t>
-      </w:r>
-    </w:p>
-    <w:p>
-      <w:pPr>
-        <w:pStyle w:val="ListBullet"/>
-        <w:spacing w:after="60"/>
-        <w:ind w:left="461" w:hanging="259"/>
-      </w:pPr>
-      <w:r>
-        <w:t>Apoiar tecnicamente a Central de Serviços</w:t>
-      </w:r>
-    </w:p>
-    <w:p>
-      <w:pPr>
-        <w:pStyle w:val="ListBullet"/>
-        <w:spacing w:after="60"/>
-        <w:ind w:left="461" w:hanging="259"/>
-      </w:pPr>
-      <w:r>
-        <w:t>Registrar detalhadamente as ações executadas no chamado</w:t>
-      </w:r>
-    </w:p>
-    <w:p>
-      <w:pPr>
-        <w:pStyle w:val="ListBullet"/>
-        <w:spacing w:after="60"/>
-        <w:ind w:left="461" w:hanging="259"/>
-      </w:pPr>
-      <w:r>
-        <w:t>Atender demandas de equipamento, rede e infraestrutura escalonadas pela Central de Serviços que exigem visita técnica</w:t>
-      </w:r>
-    </w:p>
-    <w:p>
-      <w:pPr>
-        <w:pStyle w:val="ListBullet"/>
-        <w:spacing w:after="60"/>
-        <w:ind w:left="461" w:hanging="259"/>
-      </w:pPr>
-      <w:r>
-        <w:t>Realizar manutenção, substituição ou configuração de ativos de TI (computadores, impressoras, pontos de rede, entre outros)</w:t>
-      </w:r>
-    </w:p>
-    <w:p>
-      <w:pPr>
-        <w:pStyle w:val="ListBullet"/>
-        <w:spacing w:after="60"/>
-        <w:ind w:left="461" w:hanging="259"/>
-      </w:pPr>
-      <w:r>
-        <w:t>Diagnosticar problemas físicos de hardware e conectividade</w:t>
-      </w:r>
-    </w:p>
-    <w:p>
-      <w:pPr>
-        <w:pStyle w:val="ListBullet"/>
-        <w:spacing w:after="60"/>
-        <w:ind w:left="461" w:hanging="259"/>
-      </w:pPr>
-      <w:r>
-        <w:t>Registrar detalhadamente as ações executadas no chamado</w:t>
-      </w:r>
-    </w:p>
-    <w:p>
-      <w:pPr>
-        <w:pStyle w:val="ListBullet"/>
-        <w:spacing w:after="60"/>
-        <w:ind w:left="461" w:hanging="259"/>
-      </w:pPr>
-      <w:r>
-        <w:t>Atender demandas técnicas de sistemas escalonadas pela Central de Serviços que podem ser resolvidas remotamente, sem necessidade de deslocamento</w:t>
-      </w:r>
-    </w:p>
-    <w:p>
-      <w:pPr>
-        <w:pStyle w:val="ListBullet"/>
-        <w:spacing w:after="60"/>
-        <w:ind w:left="461" w:hanging="259"/>
-      </w:pPr>
-      <w:r>
-        <w:t>Realizar análises mais aprofundadas e apoiar tecnicamente a Central de Serviços</w:t>
-      </w:r>
-    </w:p>
-    <w:p>
-      <w:pPr>
-        <w:pStyle w:val="ListBullet"/>
-        <w:spacing w:after="60"/>
-        <w:ind w:left="461" w:hanging="259"/>
-      </w:pPr>
-      <w:r>
-        <w:t>Validar informações, coordenar encaminhamentos e apoiar outros níveis quando necessário</w:t>
-      </w:r>
-    </w:p>
-    <w:p>
-      <w:pPr>
-        <w:pStyle w:val="ListBullet"/>
-        <w:spacing w:after="60"/>
-        <w:ind w:left="461" w:hanging="259"/>
-      </w:pPr>
-      <w:r>
-        <w:t>Registrar detalhadamente as ações executadas no chamado</w:t>
-      </w:r>
-    </w:p>
-    <w:p>
-      <w:pPr>
-        <w:pStyle w:val="ListBullet"/>
-        <w:spacing w:after="60"/>
-        <w:ind w:left="461" w:hanging="259"/>
-      </w:pPr>
-      <w:r>
-        <w:t>Atuar em demandas especializadas e críticas</w:t>
-      </w:r>
-    </w:p>
-    <w:p>
-      <w:pPr>
-        <w:pStyle w:val="ListBullet"/>
-        <w:spacing w:after="60"/>
-        <w:ind w:left="461" w:hanging="259"/>
-      </w:pPr>
-      <w:r>
-        <w:t>Executar correções estruturais</w:t>
-      </w:r>
-    </w:p>
-    <w:p>
-      <w:pPr>
-        <w:pStyle w:val="ListBullet"/>
-        <w:spacing w:after="60"/>
-        <w:ind w:left="461" w:hanging="259"/>
-      </w:pPr>
-      <w:r>
-        <w:t>Realizar análises de causa raiz</w:t>
-      </w:r>
-    </w:p>
-    <w:p>
-      <w:pPr>
-        <w:pStyle w:val="ListBullet"/>
-        <w:spacing w:after="60"/>
-        <w:ind w:left="461" w:hanging="259"/>
-      </w:pPr>
-      <w:r>
-        <w:t>Apoiar tecnicamente os demais níveis quando necessário</w:t>
-      </w:r>
     </w:p>
     <w:sectPr>
       <w:headerReference w:type="default" r:id="rId9"/>

</xml_diff>